<commit_message>
Affiche des heures fixé à coté de la ligne dans horaires
</commit_message>
<xml_diff>
--- a/doc/PAPRO1_2024/Rapport-PAPRO1.docx
+++ b/doc/PAPRO1_2024/Rapport-PAPRO1.docx
@@ -4057,6 +4057,17 @@
         <w:t>storys</w:t>
       </w:r>
       <w:proofErr w:type="spellEnd"/>
+      <w:r>
+        <w:t xml:space="preserve">. Les sprints </w:t>
+      </w:r>
+      <w:proofErr w:type="spellStart"/>
+      <w:r>
+        <w:t>review</w:t>
+      </w:r>
+      <w:proofErr w:type="spellEnd"/>
+      <w:r>
+        <w:t xml:space="preserve"> se dérouleront le vendredi à 14H45 les dernières semaines des sprints. </w:t>
+      </w:r>
     </w:p>
     <w:p>
       <w:pPr>
@@ -4126,6 +4137,33 @@
           <w:szCs w:val="14"/>
         </w:rPr>
         <w:t>-Drive</w:t>
+      </w:r>
+    </w:p>
+    <w:p>
+      <w:pPr>
+        <w:rPr>
+          <w:szCs w:val="14"/>
+        </w:rPr>
+      </w:pPr>
+      <w:r>
+        <w:rPr>
+          <w:szCs w:val="14"/>
+        </w:rPr>
+        <w:t xml:space="preserve">Sprint </w:t>
+      </w:r>
+      <w:proofErr w:type="spellStart"/>
+      <w:r>
+        <w:rPr>
+          <w:szCs w:val="14"/>
+        </w:rPr>
+        <w:t>review</w:t>
+      </w:r>
+      <w:proofErr w:type="spellEnd"/>
+      <w:r>
+        <w:rPr>
+          <w:szCs w:val="14"/>
+        </w:rPr>
+        <w:t xml:space="preserve"> du sprint numéro 1 : 14H45 le 09.02.2024</w:t>
       </w:r>
     </w:p>
     <w:p>
@@ -4252,6 +4290,73 @@
           <w:lang w:eastAsia="fr-FR"/>
         </w:rPr>
       </w:pPr>
+      <w:r>
+        <w:rPr>
+          <w:rFonts w:ascii="Arial" w:hAnsi="Arial"/>
+          <w:sz w:val="24"/>
+          <w:szCs w:val="14"/>
+          <w:lang w:eastAsia="fr-FR"/>
+        </w:rPr>
+        <w:t xml:space="preserve">Pour mon analyse je vais analyser chaque user story et </w:t>
+      </w:r>
+      <w:r>
+        <w:rPr>
+          <w:rFonts w:ascii="Arial" w:hAnsi="Arial"/>
+          <w:sz w:val="24"/>
+          <w:szCs w:val="14"/>
+          <w:lang w:eastAsia="fr-FR"/>
+        </w:rPr>
+        <w:t>réfléchir</w:t>
+      </w:r>
+      <w:r>
+        <w:rPr>
+          <w:rFonts w:ascii="Arial" w:hAnsi="Arial"/>
+          <w:sz w:val="24"/>
+          <w:szCs w:val="14"/>
+          <w:lang w:eastAsia="fr-FR"/>
+        </w:rPr>
+        <w:t xml:space="preserve"> </w:t>
+      </w:r>
+      <w:r>
+        <w:rPr>
+          <w:rFonts w:ascii="Arial" w:hAnsi="Arial"/>
+          <w:sz w:val="24"/>
+          <w:szCs w:val="14"/>
+          <w:lang w:eastAsia="fr-FR"/>
+        </w:rPr>
+        <w:t xml:space="preserve">à </w:t>
+      </w:r>
+      <w:proofErr w:type="gramStart"/>
+      <w:r>
+        <w:rPr>
+          <w:rFonts w:ascii="Arial" w:hAnsi="Arial"/>
+          <w:sz w:val="24"/>
+          <w:szCs w:val="14"/>
+          <w:lang w:eastAsia="fr-FR"/>
+        </w:rPr>
+        <w:t>comment  les</w:t>
+      </w:r>
+      <w:proofErr w:type="gramEnd"/>
+      <w:r>
+        <w:rPr>
+          <w:rFonts w:ascii="Arial" w:hAnsi="Arial"/>
+          <w:sz w:val="24"/>
+          <w:szCs w:val="14"/>
+          <w:lang w:eastAsia="fr-FR"/>
+        </w:rPr>
+        <w:t xml:space="preserve"> </w:t>
+      </w:r>
+      <w:bookmarkStart w:id="6" w:name="_GoBack"/>
+      <w:bookmarkEnd w:id="6"/>
+      <w:r>
+        <w:rPr>
+          <w:rFonts w:ascii="Arial" w:hAnsi="Arial"/>
+          <w:sz w:val="24"/>
+          <w:szCs w:val="14"/>
+          <w:lang w:eastAsia="fr-FR"/>
+        </w:rPr>
+        <w:t>intégrer</w:t>
+      </w:r>
     </w:p>
     <w:p>
       <w:pPr>
@@ -4263,46 +4368,11 @@
         <w:ind w:left="360"/>
         <w:rPr>
           <w:rFonts w:ascii="Arial" w:hAnsi="Arial"/>
-          <w:i/>
-          <w:iCs/>
           <w:sz w:val="24"/>
-          <w:szCs w:val="24"/>
+          <w:szCs w:val="14"/>
           <w:lang w:eastAsia="fr-FR"/>
         </w:rPr>
       </w:pPr>
-      <w:r>
-        <w:rPr>
-          <w:rFonts w:ascii="Arial" w:hAnsi="Arial"/>
-          <w:i/>
-          <w:iCs/>
-          <w:sz w:val="24"/>
-          <w:szCs w:val="24"/>
-          <w:lang w:eastAsia="fr-FR"/>
-        </w:rPr>
-        <w:t>Le concept</w:t>
-      </w:r>
-      <w:r>
-        <w:rPr>
-          <w:rFonts w:ascii="Arial" w:hAnsi="Arial"/>
-          <w:i/>
-          <w:iCs/>
-          <w:sz w:val="24"/>
-          <w:szCs w:val="24"/>
-          <w:lang w:eastAsia="fr-FR"/>
-        </w:rPr>
-        <w:t xml:space="preserve"> complet avec toutes ses </w:t>
-      </w:r>
-      <w:r>
-        <w:rPr>
-          <w:rFonts w:ascii="Arial" w:hAnsi="Arial"/>
-          <w:i/>
-          <w:iCs/>
-          <w:sz w:val="24"/>
-          <w:szCs w:val="24"/>
-          <w:lang w:eastAsia="fr-FR"/>
-        </w:rPr>
-        <w:t>annexes :</w:t>
-      </w:r>
     </w:p>
     <w:p>
       <w:pPr>
@@ -4317,10 +4387,43 @@
           <w:i/>
           <w:iCs/>
           <w:sz w:val="24"/>
-          <w:szCs w:val="14"/>
+          <w:szCs w:val="24"/>
           <w:lang w:eastAsia="fr-FR"/>
         </w:rPr>
       </w:pPr>
+      <w:r>
+        <w:rPr>
+          <w:rFonts w:ascii="Arial" w:hAnsi="Arial"/>
+          <w:i/>
+          <w:iCs/>
+          <w:sz w:val="24"/>
+          <w:szCs w:val="24"/>
+          <w:lang w:eastAsia="fr-FR"/>
+        </w:rPr>
+        <w:t>Le concept</w:t>
+      </w:r>
+      <w:r>
+        <w:rPr>
+          <w:rFonts w:ascii="Arial" w:hAnsi="Arial"/>
+          <w:i/>
+          <w:iCs/>
+          <w:sz w:val="24"/>
+          <w:szCs w:val="24"/>
+          <w:lang w:eastAsia="fr-FR"/>
+        </w:rPr>
+        <w:t xml:space="preserve"> complet avec toutes ses </w:t>
+      </w:r>
+      <w:r>
+        <w:rPr>
+          <w:rFonts w:ascii="Arial" w:hAnsi="Arial"/>
+          <w:i/>
+          <w:iCs/>
+          <w:sz w:val="24"/>
+          <w:szCs w:val="24"/>
+          <w:lang w:eastAsia="fr-FR"/>
+        </w:rPr>
+        <w:t>annexes :</w:t>
+      </w:r>
     </w:p>
     <w:p>
       <w:pPr>
@@ -4334,184 +4437,11 @@
           <w:rFonts w:ascii="Arial" w:hAnsi="Arial"/>
           <w:i/>
           <w:iCs/>
-          <w:color w:val="FF0000"/>
           <w:sz w:val="24"/>
           <w:szCs w:val="14"/>
           <w:lang w:eastAsia="fr-FR"/>
         </w:rPr>
       </w:pPr>
-      <w:r>
-        <w:rPr>
-          <w:rFonts w:ascii="Arial" w:hAnsi="Arial"/>
-          <w:i/>
-          <w:iCs/>
-          <w:color w:val="FF0000"/>
-          <w:sz w:val="24"/>
-          <w:szCs w:val="14"/>
-          <w:lang w:eastAsia="fr-FR"/>
-        </w:rPr>
-        <w:t>Au minimum :</w:t>
-      </w:r>
-    </w:p>
-    <w:p>
-      <w:pPr>
-        <w:pStyle w:val="Retraitnormal1"/>
-        <w:numPr>
-          <w:ilvl w:val="0"/>
-          <w:numId w:val="15"/>
-        </w:numPr>
-        <w:rPr>
-          <w:rFonts w:ascii="Arial" w:hAnsi="Arial"/>
-          <w:i/>
-          <w:iCs/>
-          <w:color w:val="FF0000"/>
-          <w:sz w:val="24"/>
-          <w:szCs w:val="14"/>
-          <w:lang w:eastAsia="fr-FR"/>
-        </w:rPr>
-      </w:pPr>
-      <w:r>
-        <w:rPr>
-          <w:rFonts w:ascii="Arial" w:hAnsi="Arial"/>
-          <w:i/>
-          <w:iCs/>
-          <w:color w:val="FF0000"/>
-          <w:sz w:val="24"/>
-          <w:szCs w:val="14"/>
-          <w:lang w:eastAsia="fr-FR"/>
-        </w:rPr>
-        <w:t>Un ou plusieurs schémas de contexte montrant le système dans son environnement d’utilisation, ainsi que ses utilisateurs. Ce type schéma doit être accompagné d’explications textuelles</w:t>
-      </w:r>
-    </w:p>
-    <w:p>
-      <w:pPr>
-        <w:pStyle w:val="Retraitnormal1"/>
-        <w:numPr>
-          <w:ilvl w:val="0"/>
-          <w:numId w:val="15"/>
-        </w:numPr>
-        <w:rPr>
-          <w:rFonts w:ascii="Arial" w:hAnsi="Arial"/>
-          <w:i/>
-          <w:iCs/>
-          <w:color w:val="FF0000"/>
-          <w:sz w:val="24"/>
-          <w:szCs w:val="14"/>
-          <w:lang w:eastAsia="fr-FR"/>
-        </w:rPr>
-      </w:pPr>
-      <w:r>
-        <w:rPr>
-          <w:rFonts w:ascii="Arial" w:hAnsi="Arial"/>
-          <w:i/>
-          <w:iCs/>
-          <w:color w:val="FF0000"/>
-          <w:sz w:val="24"/>
-          <w:szCs w:val="14"/>
-          <w:lang w:eastAsia="fr-FR"/>
-        </w:rPr>
-        <w:t xml:space="preserve">Un ou plusieurs schémas d’architecture montrant la structure </w:t>
-      </w:r>
-      <w:r>
-        <w:rPr>
-          <w:rFonts w:ascii="Arial" w:hAnsi="Arial"/>
-          <w:i/>
-          <w:iCs/>
-          <w:color w:val="FF0000"/>
-          <w:sz w:val="24"/>
-          <w:szCs w:val="14"/>
-          <w:lang w:eastAsia="fr-FR"/>
-        </w:rPr>
-        <w:t xml:space="preserve">interne </w:t>
-      </w:r>
-      <w:r>
-        <w:rPr>
-          <w:rFonts w:ascii="Arial" w:hAnsi="Arial"/>
-          <w:i/>
-          <w:iCs/>
-          <w:color w:val="FF0000"/>
-          <w:sz w:val="24"/>
-          <w:szCs w:val="14"/>
-          <w:lang w:eastAsia="fr-FR"/>
-        </w:rPr>
-        <w:t>du système. Ce type schéma doit être accompagné d’explications textuelles</w:t>
-      </w:r>
-    </w:p>
-    <w:p>
-      <w:pPr>
-        <w:pStyle w:val="Retraitnormal1"/>
-        <w:numPr>
-          <w:ilvl w:val="0"/>
-          <w:numId w:val="15"/>
-        </w:numPr>
-        <w:rPr>
-          <w:rFonts w:ascii="Arial" w:hAnsi="Arial"/>
-          <w:i/>
-          <w:iCs/>
-          <w:color w:val="FF0000"/>
-          <w:sz w:val="24"/>
-          <w:szCs w:val="14"/>
-          <w:lang w:eastAsia="fr-FR"/>
-        </w:rPr>
-      </w:pPr>
-      <w:r>
-        <w:rPr>
-          <w:rFonts w:ascii="Arial" w:hAnsi="Arial"/>
-          <w:i/>
-          <w:iCs/>
-          <w:color w:val="FF0000"/>
-          <w:sz w:val="24"/>
-          <w:szCs w:val="14"/>
-          <w:lang w:eastAsia="fr-FR"/>
-        </w:rPr>
-        <w:t>Un modèle conceptuel des données</w:t>
-      </w:r>
-      <w:r>
-        <w:rPr>
-          <w:rFonts w:ascii="Arial" w:hAnsi="Arial"/>
-          <w:i/>
-          <w:iCs/>
-          <w:color w:val="FF0000"/>
-          <w:sz w:val="24"/>
-          <w:szCs w:val="14"/>
-          <w:lang w:eastAsia="fr-FR"/>
-        </w:rPr>
-        <w:t xml:space="preserve">, accompagné d’une explication pour chaque entité/attribut possédant une </w:t>
-      </w:r>
-      <w:commentRangeStart w:id="6"/>
-      <w:r>
-        <w:rPr>
-          <w:rFonts w:ascii="Arial" w:hAnsi="Arial"/>
-          <w:i/>
-          <w:iCs/>
-          <w:color w:val="FF0000"/>
-          <w:sz w:val="24"/>
-          <w:szCs w:val="14"/>
-          <w:lang w:eastAsia="fr-FR"/>
-        </w:rPr>
-        <w:t>particularité</w:t>
-      </w:r>
-      <w:commentRangeEnd w:id="6"/>
-      <w:r>
-        <w:rPr>
-          <w:rStyle w:val="Marquedecommentaire"/>
-          <w:rFonts w:ascii="Arial" w:hAnsi="Arial"/>
-          <w:lang w:eastAsia="fr-FR"/>
-        </w:rPr>
-        <w:commentReference w:id="6"/>
-      </w:r>
-      <w:r>
-        <w:rPr>
-          <w:rFonts w:ascii="Arial" w:hAnsi="Arial"/>
-          <w:i/>
-          <w:iCs/>
-          <w:color w:val="FF0000"/>
-          <w:sz w:val="24"/>
-          <w:szCs w:val="14"/>
-          <w:lang w:eastAsia="fr-FR"/>
-        </w:rPr>
-        <w:t>.</w:t>
-      </w:r>
     </w:p>
     <w:p>
       <w:pPr>
@@ -4531,6 +4461,178 @@
           <w:lang w:eastAsia="fr-FR"/>
         </w:rPr>
       </w:pPr>
+      <w:r>
+        <w:rPr>
+          <w:rFonts w:ascii="Arial" w:hAnsi="Arial"/>
+          <w:i/>
+          <w:iCs/>
+          <w:color w:val="FF0000"/>
+          <w:sz w:val="24"/>
+          <w:szCs w:val="14"/>
+          <w:lang w:eastAsia="fr-FR"/>
+        </w:rPr>
+        <w:t>Au minimum :</w:t>
+      </w:r>
+    </w:p>
+    <w:p>
+      <w:pPr>
+        <w:pStyle w:val="Retraitnormal1"/>
+        <w:numPr>
+          <w:ilvl w:val="0"/>
+          <w:numId w:val="15"/>
+        </w:numPr>
+        <w:rPr>
+          <w:rFonts w:ascii="Arial" w:hAnsi="Arial"/>
+          <w:i/>
+          <w:iCs/>
+          <w:color w:val="FF0000"/>
+          <w:sz w:val="24"/>
+          <w:szCs w:val="14"/>
+          <w:lang w:eastAsia="fr-FR"/>
+        </w:rPr>
+      </w:pPr>
+      <w:r>
+        <w:rPr>
+          <w:rFonts w:ascii="Arial" w:hAnsi="Arial"/>
+          <w:i/>
+          <w:iCs/>
+          <w:color w:val="FF0000"/>
+          <w:sz w:val="24"/>
+          <w:szCs w:val="14"/>
+          <w:lang w:eastAsia="fr-FR"/>
+        </w:rPr>
+        <w:t>Un ou plusieurs schémas de contexte montrant le système dans son environnement d’utilisation, ainsi que ses utilisateurs. Ce type schéma doit être accompagné d’explications textuelles</w:t>
+      </w:r>
+    </w:p>
+    <w:p>
+      <w:pPr>
+        <w:pStyle w:val="Retraitnormal1"/>
+        <w:numPr>
+          <w:ilvl w:val="0"/>
+          <w:numId w:val="15"/>
+        </w:numPr>
+        <w:rPr>
+          <w:rFonts w:ascii="Arial" w:hAnsi="Arial"/>
+          <w:i/>
+          <w:iCs/>
+          <w:color w:val="FF0000"/>
+          <w:sz w:val="24"/>
+          <w:szCs w:val="14"/>
+          <w:lang w:eastAsia="fr-FR"/>
+        </w:rPr>
+      </w:pPr>
+      <w:r>
+        <w:rPr>
+          <w:rFonts w:ascii="Arial" w:hAnsi="Arial"/>
+          <w:i/>
+          <w:iCs/>
+          <w:color w:val="FF0000"/>
+          <w:sz w:val="24"/>
+          <w:szCs w:val="14"/>
+          <w:lang w:eastAsia="fr-FR"/>
+        </w:rPr>
+        <w:t xml:space="preserve">Un ou plusieurs schémas d’architecture montrant la structure </w:t>
+      </w:r>
+      <w:r>
+        <w:rPr>
+          <w:rFonts w:ascii="Arial" w:hAnsi="Arial"/>
+          <w:i/>
+          <w:iCs/>
+          <w:color w:val="FF0000"/>
+          <w:sz w:val="24"/>
+          <w:szCs w:val="14"/>
+          <w:lang w:eastAsia="fr-FR"/>
+        </w:rPr>
+        <w:t xml:space="preserve">interne </w:t>
+      </w:r>
+      <w:r>
+        <w:rPr>
+          <w:rFonts w:ascii="Arial" w:hAnsi="Arial"/>
+          <w:i/>
+          <w:iCs/>
+          <w:color w:val="FF0000"/>
+          <w:sz w:val="24"/>
+          <w:szCs w:val="14"/>
+          <w:lang w:eastAsia="fr-FR"/>
+        </w:rPr>
+        <w:t>du système. Ce type schéma doit être accompagné d’explications textuelles</w:t>
+      </w:r>
+    </w:p>
+    <w:p>
+      <w:pPr>
+        <w:pStyle w:val="Retraitnormal1"/>
+        <w:numPr>
+          <w:ilvl w:val="0"/>
+          <w:numId w:val="15"/>
+        </w:numPr>
+        <w:rPr>
+          <w:rFonts w:ascii="Arial" w:hAnsi="Arial"/>
+          <w:i/>
+          <w:iCs/>
+          <w:color w:val="FF0000"/>
+          <w:sz w:val="24"/>
+          <w:szCs w:val="14"/>
+          <w:lang w:eastAsia="fr-FR"/>
+        </w:rPr>
+      </w:pPr>
+      <w:r>
+        <w:rPr>
+          <w:rFonts w:ascii="Arial" w:hAnsi="Arial"/>
+          <w:i/>
+          <w:iCs/>
+          <w:color w:val="FF0000"/>
+          <w:sz w:val="24"/>
+          <w:szCs w:val="14"/>
+          <w:lang w:eastAsia="fr-FR"/>
+        </w:rPr>
+        <w:t>Un modèle conceptuel des données</w:t>
+      </w:r>
+      <w:r>
+        <w:rPr>
+          <w:rFonts w:ascii="Arial" w:hAnsi="Arial"/>
+          <w:i/>
+          <w:iCs/>
+          <w:color w:val="FF0000"/>
+          <w:sz w:val="24"/>
+          <w:szCs w:val="14"/>
+          <w:lang w:eastAsia="fr-FR"/>
+        </w:rPr>
+        <w:t xml:space="preserve">, accompagné d’une explication pour chaque entité/attribut possédant une </w:t>
+      </w:r>
+      <w:commentRangeStart w:id="7"/>
+      <w:r>
+        <w:rPr>
+          <w:rFonts w:ascii="Arial" w:hAnsi="Arial"/>
+          <w:i/>
+          <w:iCs/>
+          <w:color w:val="FF0000"/>
+          <w:sz w:val="24"/>
+          <w:szCs w:val="14"/>
+          <w:lang w:eastAsia="fr-FR"/>
+        </w:rPr>
+        <w:t>particularité</w:t>
+      </w:r>
+      <w:commentRangeEnd w:id="7"/>
+      <w:r>
+        <w:rPr>
+          <w:rStyle w:val="Marquedecommentaire"/>
+          <w:rFonts w:ascii="Arial" w:hAnsi="Arial"/>
+          <w:lang w:eastAsia="fr-FR"/>
+        </w:rPr>
+        <w:commentReference w:id="7"/>
+      </w:r>
+      <w:r>
+        <w:rPr>
+          <w:rFonts w:ascii="Arial" w:hAnsi="Arial"/>
+          <w:i/>
+          <w:iCs/>
+          <w:color w:val="FF0000"/>
+          <w:sz w:val="24"/>
+          <w:szCs w:val="14"/>
+          <w:lang w:eastAsia="fr-FR"/>
+        </w:rPr>
+        <w:t>.</w:t>
+      </w:r>
     </w:p>
     <w:p>
       <w:pPr>
@@ -4550,6 +4652,25 @@
           <w:lang w:eastAsia="fr-FR"/>
         </w:rPr>
       </w:pPr>
+    </w:p>
+    <w:p>
+      <w:pPr>
+        <w:pStyle w:val="Retraitnormal1"/>
+        <w:numPr>
+          <w:ilvl w:val="0"/>
+          <w:numId w:val="0"/>
+        </w:numPr>
+        <w:ind w:left="360"/>
+        <w:rPr>
+          <w:rFonts w:ascii="Arial" w:hAnsi="Arial"/>
+          <w:i/>
+          <w:iCs/>
+          <w:color w:val="FF0000"/>
+          <w:sz w:val="24"/>
+          <w:szCs w:val="14"/>
+          <w:lang w:eastAsia="fr-FR"/>
+        </w:rPr>
+      </w:pPr>
       <w:r>
         <w:rPr>
           <w:rFonts w:ascii="Arial" w:hAnsi="Arial"/>
@@ -4809,6 +4930,7 @@
           <w:szCs w:val="24"/>
           <w:lang w:eastAsia="fr-FR"/>
         </w:rPr>
+        <w:lastRenderedPageBreak/>
         <w:t>Programmation :</w:t>
       </w:r>
       <w:r>
@@ -4919,14 +5041,13 @@
           <w:iCs/>
         </w:rPr>
       </w:pPr>
-      <w:bookmarkStart w:id="7" w:name="_Toc71691012"/>
-      <w:bookmarkStart w:id="8" w:name="_Toc499021838"/>
+      <w:bookmarkStart w:id="8" w:name="_Toc71691012"/>
+      <w:bookmarkStart w:id="9" w:name="_Toc499021838"/>
       <w:r>
         <w:rPr>
           <w:i w:val="0"/>
           <w:iCs/>
         </w:rPr>
-        <w:lastRenderedPageBreak/>
         <w:t>Analyse fonctionnelle</w:t>
       </w:r>
     </w:p>
@@ -4959,12 +5080,6 @@
         <w:gridCol w:w="9060"/>
       </w:tblGrid>
       <w:tr>
-        <w:tblPrEx>
-          <w:tblCellMar>
-            <w:top w:w="0" w:type="dxa"/>
-            <w:bottom w:w="0" w:type="dxa"/>
-          </w:tblCellMar>
-        </w:tblPrEx>
         <w:tc>
           <w:tcPr>
             <w:tcW w:w="0" w:type="auto"/>
@@ -4977,12 +5092,6 @@
         </w:tc>
       </w:tr>
       <w:tr>
-        <w:tblPrEx>
-          <w:tblCellMar>
-            <w:top w:w="0" w:type="dxa"/>
-            <w:bottom w:w="0" w:type="dxa"/>
-          </w:tblCellMar>
-        </w:tblPrEx>
         <w:tc>
           <w:tcPr>
             <w:tcW w:w="0" w:type="auto"/>
@@ -5017,12 +5126,6 @@
               <w:gridCol w:w="7704"/>
             </w:tblGrid>
             <w:tr>
-              <w:tblPrEx>
-                <w:tblCellMar>
-                  <w:top w:w="0" w:type="dxa"/>
-                  <w:bottom w:w="0" w:type="dxa"/>
-                </w:tblCellMar>
-              </w:tblPrEx>
               <w:tc>
                 <w:tcPr>
                   <w:tcW w:w="0" w:type="auto"/>
@@ -5215,12 +5318,6 @@
         <w:gridCol w:w="6656"/>
       </w:tblGrid>
       <w:tr>
-        <w:tblPrEx>
-          <w:tblCellMar>
-            <w:top w:w="0" w:type="dxa"/>
-            <w:bottom w:w="0" w:type="dxa"/>
-          </w:tblCellMar>
-        </w:tblPrEx>
         <w:tc>
           <w:tcPr>
             <w:tcW w:w="0" w:type="auto"/>
@@ -5256,12 +5353,6 @@
         </w:tc>
       </w:tr>
       <w:tr>
-        <w:tblPrEx>
-          <w:tblCellMar>
-            <w:top w:w="0" w:type="dxa"/>
-            <w:bottom w:w="0" w:type="dxa"/>
-          </w:tblCellMar>
-        </w:tblPrEx>
         <w:tc>
           <w:tcPr>
             <w:tcW w:w="0" w:type="auto"/>
@@ -5297,12 +5388,6 @@
         </w:tc>
       </w:tr>
       <w:tr>
-        <w:tblPrEx>
-          <w:tblCellMar>
-            <w:top w:w="0" w:type="dxa"/>
-            <w:bottom w:w="0" w:type="dxa"/>
-          </w:tblCellMar>
-        </w:tblPrEx>
         <w:tc>
           <w:tcPr>
             <w:tcW w:w="0" w:type="auto"/>
@@ -5341,12 +5426,6 @@
         </w:tc>
       </w:tr>
       <w:tr>
-        <w:tblPrEx>
-          <w:tblCellMar>
-            <w:top w:w="0" w:type="dxa"/>
-            <w:bottom w:w="0" w:type="dxa"/>
-          </w:tblCellMar>
-        </w:tblPrEx>
         <w:tc>
           <w:tcPr>
             <w:tcW w:w="0" w:type="auto"/>
@@ -5516,12 +5595,6 @@
         <w:gridCol w:w="7034"/>
       </w:tblGrid>
       <w:tr>
-        <w:tblPrEx>
-          <w:tblCellMar>
-            <w:top w:w="0" w:type="dxa"/>
-            <w:bottom w:w="0" w:type="dxa"/>
-          </w:tblCellMar>
-        </w:tblPrEx>
         <w:tc>
           <w:tcPr>
             <w:tcW w:w="0" w:type="auto"/>
@@ -5557,12 +5630,6 @@
         </w:tc>
       </w:tr>
       <w:tr>
-        <w:tblPrEx>
-          <w:tblCellMar>
-            <w:top w:w="0" w:type="dxa"/>
-            <w:bottom w:w="0" w:type="dxa"/>
-          </w:tblCellMar>
-        </w:tblPrEx>
         <w:tc>
           <w:tcPr>
             <w:tcW w:w="0" w:type="auto"/>
@@ -5742,12 +5809,6 @@
         <w:gridCol w:w="6930"/>
       </w:tblGrid>
       <w:tr>
-        <w:tblPrEx>
-          <w:tblCellMar>
-            <w:top w:w="0" w:type="dxa"/>
-            <w:bottom w:w="0" w:type="dxa"/>
-          </w:tblCellMar>
-        </w:tblPrEx>
         <w:tc>
           <w:tcPr>
             <w:tcW w:w="0" w:type="auto"/>
@@ -5814,8 +5875,6 @@
       <w:pPr>
         <w:jc w:val="center"/>
       </w:pPr>
-      <w:bookmarkStart w:id="9" w:name="_GoBack"/>
-      <w:bookmarkEnd w:id="9"/>
       <w:r>
         <w:rPr>
           <w:noProof/>
@@ -6015,8 +6074,8 @@
         </w:rPr>
         <w:t>Stratégie de test</w:t>
       </w:r>
-      <w:bookmarkEnd w:id="7"/>
       <w:bookmarkEnd w:id="8"/>
+      <w:bookmarkEnd w:id="9"/>
     </w:p>
     <w:p/>
     <w:p>
@@ -6181,6 +6240,7 @@
           <w:szCs w:val="14"/>
         </w:rPr>
       </w:pPr>
+      <w:proofErr w:type="gramStart"/>
       <w:r>
         <w:rPr>
           <w:i/>
@@ -6195,7 +6255,16 @@
           <w:iCs/>
           <w:szCs w:val="14"/>
         </w:rPr>
-        <w:t>ypes de des tests et ordre dans lequel ils seront effectués.</w:t>
+        <w:t>ypes</w:t>
+      </w:r>
+      <w:proofErr w:type="gramEnd"/>
+      <w:r>
+        <w:rPr>
+          <w:i/>
+          <w:iCs/>
+          <w:szCs w:val="14"/>
+        </w:rPr>
+        <w:t xml:space="preserve"> de des tests et ordre dans lequel ils seront effectués.</w:t>
       </w:r>
     </w:p>
     <w:p>
@@ -6215,6 +6284,7 @@
           <w:szCs w:val="14"/>
         </w:rPr>
       </w:pPr>
+      <w:proofErr w:type="gramStart"/>
       <w:r>
         <w:rPr>
           <w:i/>
@@ -6229,7 +6299,16 @@
           <w:iCs/>
           <w:szCs w:val="14"/>
         </w:rPr>
-        <w:t>es moyens à mettre en œuvre</w:t>
+        <w:t>es</w:t>
+      </w:r>
+      <w:proofErr w:type="gramEnd"/>
+      <w:r>
+        <w:rPr>
+          <w:i/>
+          <w:iCs/>
+          <w:szCs w:val="14"/>
+        </w:rPr>
+        <w:t xml:space="preserve"> moyens à mettre en œuvre</w:t>
       </w:r>
       <w:r>
         <w:rPr>
@@ -6257,6 +6336,7 @@
           <w:szCs w:val="14"/>
         </w:rPr>
       </w:pPr>
+      <w:proofErr w:type="gramStart"/>
       <w:r>
         <w:rPr>
           <w:i/>
@@ -6271,7 +6351,16 @@
           <w:iCs/>
           <w:szCs w:val="14"/>
         </w:rPr>
-        <w:t>ouverture des tests (tests exhaustifs ou non, si non, pourquoi ?)</w:t>
+        <w:t>ouverture</w:t>
+      </w:r>
+      <w:proofErr w:type="gramEnd"/>
+      <w:r>
+        <w:rPr>
+          <w:i/>
+          <w:iCs/>
+          <w:szCs w:val="14"/>
+        </w:rPr>
+        <w:t xml:space="preserve"> des tests (tests exhaustifs ou non, si non, pourquoi ?)</w:t>
       </w:r>
       <w:r>
         <w:rPr>
@@ -6299,6 +6388,7 @@
           <w:szCs w:val="14"/>
         </w:rPr>
       </w:pPr>
+      <w:proofErr w:type="gramStart"/>
       <w:r>
         <w:rPr>
           <w:i/>
@@ -6313,7 +6403,16 @@
           <w:iCs/>
           <w:szCs w:val="14"/>
         </w:rPr>
-        <w:t>onnées de test à prévoir (données réelles ?)</w:t>
+        <w:t>onnées</w:t>
+      </w:r>
+      <w:proofErr w:type="gramEnd"/>
+      <w:r>
+        <w:rPr>
+          <w:i/>
+          <w:iCs/>
+          <w:szCs w:val="14"/>
+        </w:rPr>
+        <w:t xml:space="preserve"> de test à prévoir (données réelles ?)</w:t>
       </w:r>
       <w:r>
         <w:rPr>
@@ -6360,13 +6459,23 @@
           <w:szCs w:val="14"/>
         </w:rPr>
       </w:pPr>
-      <w:r>
-        <w:rPr>
-          <w:i/>
-          <w:iCs/>
-          <w:szCs w:val="14"/>
-        </w:rPr>
-        <w:t>les testeurs extérieurs éventuels.</w:t>
+      <w:proofErr w:type="gramStart"/>
+      <w:r>
+        <w:rPr>
+          <w:i/>
+          <w:iCs/>
+          <w:szCs w:val="14"/>
+        </w:rPr>
+        <w:t>les</w:t>
+      </w:r>
+      <w:proofErr w:type="gramEnd"/>
+      <w:r>
+        <w:rPr>
+          <w:i/>
+          <w:iCs/>
+          <w:szCs w:val="14"/>
+        </w:rPr>
+        <w:t xml:space="preserve"> testeurs extérieurs éventuels.</w:t>
       </w:r>
     </w:p>
     <w:p>
@@ -6453,13 +6562,23 @@
           <w:sz w:val="24"/>
         </w:rPr>
       </w:pPr>
+      <w:proofErr w:type="gramStart"/>
       <w:r>
         <w:rPr>
           <w:rFonts w:ascii="Arial" w:hAnsi="Arial" w:cs="Arial"/>
           <w:i/>
           <w:sz w:val="24"/>
         </w:rPr>
-        <w:t>risques techniques (complexité, manque de compétences, …)</w:t>
+        <w:t>risques</w:t>
+      </w:r>
+      <w:proofErr w:type="gramEnd"/>
+      <w:r>
+        <w:rPr>
+          <w:rFonts w:ascii="Arial" w:hAnsi="Arial" w:cs="Arial"/>
+          <w:i/>
+          <w:sz w:val="24"/>
+        </w:rPr>
+        <w:t xml:space="preserve"> techniques (complexité, manque de compétences, …)</w:t>
       </w:r>
       <w:r>
         <w:rPr>
@@ -6625,6 +6744,7 @@
           <w:lang w:eastAsia="fr-FR"/>
         </w:rPr>
       </w:pPr>
+      <w:proofErr w:type="gramStart"/>
       <w:r>
         <w:rPr>
           <w:rFonts w:ascii="Arial" w:hAnsi="Arial"/>
@@ -6635,7 +6755,20 @@
           <w:szCs w:val="14"/>
           <w:lang w:eastAsia="fr-FR"/>
         </w:rPr>
-        <w:t xml:space="preserve">planning indiquant les dates de début et de fin du projet ainsi que le découpage connu des diverses phases. </w:t>
+        <w:t>planning</w:t>
+      </w:r>
+      <w:proofErr w:type="gramEnd"/>
+      <w:r>
+        <w:rPr>
+          <w:rFonts w:ascii="Arial" w:hAnsi="Arial"/>
+          <w:i/>
+          <w:iCs/>
+          <w:strike/>
+          <w:sz w:val="24"/>
+          <w:szCs w:val="14"/>
+          <w:lang w:eastAsia="fr-FR"/>
+        </w:rPr>
+        <w:t xml:space="preserve"> indiquant les dates de début et de fin du projet ainsi que le découpage connu des diverses phases. </w:t>
       </w:r>
     </w:p>
     <w:p>
@@ -6655,6 +6788,7 @@
           <w:lang w:eastAsia="fr-FR"/>
         </w:rPr>
       </w:pPr>
+      <w:proofErr w:type="gramStart"/>
       <w:r>
         <w:rPr>
           <w:rFonts w:ascii="Arial" w:hAnsi="Arial"/>
@@ -6665,7 +6799,20 @@
           <w:szCs w:val="14"/>
           <w:lang w:eastAsia="fr-FR"/>
         </w:rPr>
-        <w:t>partage des tâches en cas de travail à plusieurs.</w:t>
+        <w:t>partage</w:t>
+      </w:r>
+      <w:proofErr w:type="gramEnd"/>
+      <w:r>
+        <w:rPr>
+          <w:rFonts w:ascii="Arial" w:hAnsi="Arial"/>
+          <w:i/>
+          <w:iCs/>
+          <w:strike/>
+          <w:sz w:val="24"/>
+          <w:szCs w:val="14"/>
+          <w:lang w:eastAsia="fr-FR"/>
+        </w:rPr>
+        <w:t xml:space="preserve"> des tâches en cas de travail à plusieurs.</w:t>
       </w:r>
     </w:p>
     <w:p>
@@ -6861,6 +7008,7 @@
           <w:sz w:val="24"/>
         </w:rPr>
       </w:pPr>
+      <w:proofErr w:type="gramStart"/>
       <w:r>
         <w:rPr>
           <w:rFonts w:ascii="Arial" w:hAnsi="Arial" w:cs="Arial"/>
@@ -6868,7 +7016,16 @@
           <w:sz w:val="24"/>
         </w:rPr>
         <w:lastRenderedPageBreak/>
-        <w:t>le choix du matériel HW</w:t>
+        <w:t>le</w:t>
+      </w:r>
+      <w:proofErr w:type="gramEnd"/>
+      <w:r>
+        <w:rPr>
+          <w:rFonts w:ascii="Arial" w:hAnsi="Arial" w:cs="Arial"/>
+          <w:i/>
+          <w:sz w:val="24"/>
+        </w:rPr>
+        <w:t xml:space="preserve"> choix du matériel HW</w:t>
       </w:r>
     </w:p>
     <w:p>
@@ -6884,13 +7041,23 @@
           <w:sz w:val="24"/>
         </w:rPr>
       </w:pPr>
+      <w:proofErr w:type="gramStart"/>
       <w:r>
         <w:rPr>
           <w:rFonts w:ascii="Arial" w:hAnsi="Arial" w:cs="Arial"/>
           <w:i/>
           <w:sz w:val="24"/>
         </w:rPr>
-        <w:t xml:space="preserve">le choix des systèmes d'exploitation pour la réalisation </w:t>
+        <w:t>le</w:t>
+      </w:r>
+      <w:proofErr w:type="gramEnd"/>
+      <w:r>
+        <w:rPr>
+          <w:rFonts w:ascii="Arial" w:hAnsi="Arial" w:cs="Arial"/>
+          <w:i/>
+          <w:sz w:val="24"/>
+        </w:rPr>
+        <w:t xml:space="preserve"> choix des systèmes d'exploitation pour la réalisation </w:t>
       </w:r>
       <w:r>
         <w:rPr>
@@ -6923,13 +7090,23 @@
           <w:sz w:val="24"/>
         </w:rPr>
       </w:pPr>
+      <w:proofErr w:type="gramStart"/>
       <w:r>
         <w:rPr>
           <w:rFonts w:ascii="Arial" w:hAnsi="Arial" w:cs="Arial"/>
           <w:i/>
           <w:sz w:val="24"/>
         </w:rPr>
-        <w:t xml:space="preserve">le choix des outils logiciels pour la réalisation </w:t>
+        <w:t>le</w:t>
+      </w:r>
+      <w:proofErr w:type="gramEnd"/>
+      <w:r>
+        <w:rPr>
+          <w:rFonts w:ascii="Arial" w:hAnsi="Arial" w:cs="Arial"/>
+          <w:i/>
+          <w:sz w:val="24"/>
+        </w:rPr>
+        <w:t xml:space="preserve"> choix des outils logiciels pour la réalisation </w:t>
       </w:r>
       <w:r>
         <w:rPr>
@@ -7863,13 +8040,23 @@
           <w:strike/>
         </w:rPr>
       </w:pPr>
+      <w:proofErr w:type="gramStart"/>
       <w:r>
         <w:rPr>
           <w:i/>
           <w:iCs/>
           <w:strike/>
         </w:rPr>
-        <w:t>les répertoires où le logiciel est installé</w:t>
+        <w:t>les</w:t>
+      </w:r>
+      <w:proofErr w:type="gramEnd"/>
+      <w:r>
+        <w:rPr>
+          <w:i/>
+          <w:iCs/>
+          <w:strike/>
+        </w:rPr>
+        <w:t xml:space="preserve"> répertoires où le logiciel est installé</w:t>
       </w:r>
     </w:p>
     <w:p>
@@ -7889,13 +8076,23 @@
           <w:strike/>
         </w:rPr>
       </w:pPr>
+      <w:proofErr w:type="gramStart"/>
       <w:r>
         <w:rPr>
           <w:i/>
           <w:iCs/>
           <w:strike/>
         </w:rPr>
-        <w:t>la liste de tous les fichiers et une rapide description de leur contenu (des noms qui parlent !)</w:t>
+        <w:t>la</w:t>
+      </w:r>
+      <w:proofErr w:type="gramEnd"/>
+      <w:r>
+        <w:rPr>
+          <w:i/>
+          <w:iCs/>
+          <w:strike/>
+        </w:rPr>
+        <w:t xml:space="preserve"> liste de tous les fichiers et une rapide description de leur contenu (des noms qui parlent !)</w:t>
       </w:r>
     </w:p>
     <w:p>
@@ -7915,13 +8112,23 @@
           <w:strike/>
         </w:rPr>
       </w:pPr>
+      <w:proofErr w:type="gramStart"/>
       <w:r>
         <w:rPr>
           <w:i/>
           <w:iCs/>
           <w:strike/>
         </w:rPr>
-        <w:t>les versions des systèmes d'exploitation et des outils logiciels</w:t>
+        <w:t>les</w:t>
+      </w:r>
+      <w:proofErr w:type="gramEnd"/>
+      <w:r>
+        <w:rPr>
+          <w:i/>
+          <w:iCs/>
+          <w:strike/>
+        </w:rPr>
+        <w:t xml:space="preserve"> versions des systèmes d'exploitation et des outils logiciels</w:t>
       </w:r>
     </w:p>
     <w:p>
@@ -7941,13 +8148,23 @@
           <w:strike/>
         </w:rPr>
       </w:pPr>
+      <w:proofErr w:type="gramStart"/>
       <w:r>
         <w:rPr>
           <w:i/>
           <w:iCs/>
           <w:strike/>
         </w:rPr>
-        <w:t>la description exacte du matériel</w:t>
+        <w:t>la</w:t>
+      </w:r>
+      <w:proofErr w:type="gramEnd"/>
+      <w:r>
+        <w:rPr>
+          <w:i/>
+          <w:iCs/>
+          <w:strike/>
+        </w:rPr>
+        <w:t xml:space="preserve"> description exacte du matériel</w:t>
       </w:r>
     </w:p>
     <w:p>
@@ -7967,13 +8184,23 @@
           <w:strike/>
         </w:rPr>
       </w:pPr>
+      <w:proofErr w:type="gramStart"/>
       <w:r>
         <w:rPr>
           <w:i/>
           <w:iCs/>
           <w:strike/>
         </w:rPr>
-        <w:t>le numé</w:t>
+        <w:t>le</w:t>
+      </w:r>
+      <w:proofErr w:type="gramEnd"/>
+      <w:r>
+        <w:rPr>
+          <w:i/>
+          <w:iCs/>
+          <w:strike/>
+        </w:rPr>
+        <w:t xml:space="preserve"> numé</w:t>
       </w:r>
       <w:r>
         <w:rPr>
@@ -8195,12 +8422,21 @@
           <w:iCs/>
         </w:rPr>
       </w:pPr>
-      <w:r>
-        <w:rPr>
-          <w:i/>
-          <w:iCs/>
-        </w:rPr>
-        <w:t>la liste de tous les fichiers et une rapide description de leur contenu (des noms qui parlent !)</w:t>
+      <w:proofErr w:type="gramStart"/>
+      <w:r>
+        <w:rPr>
+          <w:i/>
+          <w:iCs/>
+        </w:rPr>
+        <w:t>la</w:t>
+      </w:r>
+      <w:proofErr w:type="gramEnd"/>
+      <w:r>
+        <w:rPr>
+          <w:i/>
+          <w:iCs/>
+        </w:rPr>
+        <w:t xml:space="preserve"> liste de tous les fichiers et une rapide description de leur contenu (des noms qui parlent !)</w:t>
       </w:r>
     </w:p>
     <w:p>
@@ -8219,12 +8455,21 @@
           <w:iCs/>
         </w:rPr>
       </w:pPr>
-      <w:r>
-        <w:rPr>
-          <w:i/>
-          <w:iCs/>
-        </w:rPr>
-        <w:t>les versions des systèmes d'exploitation et des outils logiciels</w:t>
+      <w:proofErr w:type="gramStart"/>
+      <w:r>
+        <w:rPr>
+          <w:i/>
+          <w:iCs/>
+        </w:rPr>
+        <w:t>les</w:t>
+      </w:r>
+      <w:proofErr w:type="gramEnd"/>
+      <w:r>
+        <w:rPr>
+          <w:i/>
+          <w:iCs/>
+        </w:rPr>
+        <w:t xml:space="preserve"> versions des systèmes d'exploitation et des outils logiciels</w:t>
       </w:r>
     </w:p>
     <w:p>
@@ -8243,12 +8488,21 @@
           <w:iCs/>
         </w:rPr>
       </w:pPr>
-      <w:r>
-        <w:rPr>
-          <w:i/>
-          <w:iCs/>
-        </w:rPr>
-        <w:t>la description exacte du matériel</w:t>
+      <w:proofErr w:type="gramStart"/>
+      <w:r>
+        <w:rPr>
+          <w:i/>
+          <w:iCs/>
+        </w:rPr>
+        <w:t>la</w:t>
+      </w:r>
+      <w:proofErr w:type="gramEnd"/>
+      <w:r>
+        <w:rPr>
+          <w:i/>
+          <w:iCs/>
+        </w:rPr>
+        <w:t xml:space="preserve"> description exacte du matériel</w:t>
       </w:r>
     </w:p>
     <w:p/>
@@ -8308,12 +8562,21 @@
           <w:iCs/>
         </w:rPr>
       </w:pPr>
-      <w:r>
-        <w:rPr>
-          <w:i/>
-          <w:iCs/>
-        </w:rPr>
-        <w:t>la liste de tous les fichiers et une rapide description de leur contenu (des noms qui parlent !)</w:t>
+      <w:proofErr w:type="gramStart"/>
+      <w:r>
+        <w:rPr>
+          <w:i/>
+          <w:iCs/>
+        </w:rPr>
+        <w:t>la</w:t>
+      </w:r>
+      <w:proofErr w:type="gramEnd"/>
+      <w:r>
+        <w:rPr>
+          <w:i/>
+          <w:iCs/>
+        </w:rPr>
+        <w:t xml:space="preserve"> liste de tous les fichiers et une rapide description de leur contenu (des noms qui parlent !)</w:t>
       </w:r>
     </w:p>
     <w:p>
@@ -8332,12 +8595,21 @@
           <w:iCs/>
         </w:rPr>
       </w:pPr>
-      <w:r>
-        <w:rPr>
-          <w:i/>
-          <w:iCs/>
-        </w:rPr>
-        <w:t>les versions des systèmes d'exploitation et des outils logiciels</w:t>
+      <w:proofErr w:type="gramStart"/>
+      <w:r>
+        <w:rPr>
+          <w:i/>
+          <w:iCs/>
+        </w:rPr>
+        <w:t>les</w:t>
+      </w:r>
+      <w:proofErr w:type="gramEnd"/>
+      <w:r>
+        <w:rPr>
+          <w:i/>
+          <w:iCs/>
+        </w:rPr>
+        <w:t xml:space="preserve"> versions des systèmes d'exploitation et des outils logiciels</w:t>
       </w:r>
     </w:p>
     <w:p>
@@ -8356,12 +8628,21 @@
           <w:iCs/>
         </w:rPr>
       </w:pPr>
-      <w:r>
-        <w:rPr>
-          <w:i/>
-          <w:iCs/>
-        </w:rPr>
-        <w:t>la description exacte du matériel</w:t>
+      <w:proofErr w:type="gramStart"/>
+      <w:r>
+        <w:rPr>
+          <w:i/>
+          <w:iCs/>
+        </w:rPr>
+        <w:t>la</w:t>
+      </w:r>
+      <w:proofErr w:type="gramEnd"/>
+      <w:r>
+        <w:rPr>
+          <w:i/>
+          <w:iCs/>
+        </w:rPr>
+        <w:t xml:space="preserve"> description exacte du matériel</w:t>
       </w:r>
     </w:p>
     <w:p>
@@ -8492,12 +8773,21 @@
           <w:iCs/>
         </w:rPr>
       </w:pPr>
-      <w:r>
-        <w:rPr>
-          <w:i/>
-          <w:iCs/>
-        </w:rPr>
-        <w:t>la liste de tous les fichiers et une rapide description de leur contenu (des noms qui parlent !)</w:t>
+      <w:proofErr w:type="gramStart"/>
+      <w:r>
+        <w:rPr>
+          <w:i/>
+          <w:iCs/>
+        </w:rPr>
+        <w:t>la</w:t>
+      </w:r>
+      <w:proofErr w:type="gramEnd"/>
+      <w:r>
+        <w:rPr>
+          <w:i/>
+          <w:iCs/>
+        </w:rPr>
+        <w:t xml:space="preserve"> liste de tous les fichiers et une rapide description de leur contenu (des noms qui parlent !)</w:t>
       </w:r>
     </w:p>
     <w:p>
@@ -8516,12 +8806,21 @@
           <w:iCs/>
         </w:rPr>
       </w:pPr>
-      <w:r>
-        <w:rPr>
-          <w:i/>
-          <w:iCs/>
-        </w:rPr>
-        <w:t>les versions des systèmes d'exploitation et des outils logiciels</w:t>
+      <w:proofErr w:type="gramStart"/>
+      <w:r>
+        <w:rPr>
+          <w:i/>
+          <w:iCs/>
+        </w:rPr>
+        <w:t>les</w:t>
+      </w:r>
+      <w:proofErr w:type="gramEnd"/>
+      <w:r>
+        <w:rPr>
+          <w:i/>
+          <w:iCs/>
+        </w:rPr>
+        <w:t xml:space="preserve"> versions des systèmes d'exploitation et des outils logiciels</w:t>
       </w:r>
     </w:p>
     <w:p>
@@ -8540,12 +8839,21 @@
           <w:iCs/>
         </w:rPr>
       </w:pPr>
-      <w:r>
-        <w:rPr>
-          <w:i/>
-          <w:iCs/>
-        </w:rPr>
-        <w:t>la description exacte du matériel</w:t>
+      <w:proofErr w:type="gramStart"/>
+      <w:r>
+        <w:rPr>
+          <w:i/>
+          <w:iCs/>
+        </w:rPr>
+        <w:t>la</w:t>
+      </w:r>
+      <w:proofErr w:type="gramEnd"/>
+      <w:r>
+        <w:rPr>
+          <w:i/>
+          <w:iCs/>
+        </w:rPr>
+        <w:t xml:space="preserve"> description exacte du matériel</w:t>
       </w:r>
     </w:p>
     <w:p>
@@ -8728,12 +9036,21 @@
           <w:strike/>
         </w:rPr>
       </w:pPr>
+      <w:proofErr w:type="gramStart"/>
       <w:r>
         <w:rPr>
           <w:i/>
           <w:strike/>
         </w:rPr>
-        <w:t>les conditions exactes de chaque test</w:t>
+        <w:t>les</w:t>
+      </w:r>
+      <w:proofErr w:type="gramEnd"/>
+      <w:r>
+        <w:rPr>
+          <w:i/>
+          <w:strike/>
+        </w:rPr>
+        <w:t xml:space="preserve"> conditions exactes de chaque test</w:t>
       </w:r>
     </w:p>
     <w:p>
@@ -8747,12 +9064,21 @@
           <w:strike/>
         </w:rPr>
       </w:pPr>
+      <w:proofErr w:type="gramStart"/>
       <w:r>
         <w:rPr>
           <w:i/>
           <w:strike/>
         </w:rPr>
-        <w:t>les preuves de test (papier ou fichier)</w:t>
+        <w:t>les</w:t>
+      </w:r>
+      <w:proofErr w:type="gramEnd"/>
+      <w:r>
+        <w:rPr>
+          <w:i/>
+          <w:strike/>
+        </w:rPr>
+        <w:t xml:space="preserve"> preuves de test (papier ou fichier)</w:t>
       </w:r>
     </w:p>
     <w:p>
@@ -9148,12 +9474,21 @@
           <w:i/>
         </w:rPr>
       </w:pPr>
+      <w:proofErr w:type="gramStart"/>
       <w:r>
         <w:rPr>
           <w:rFonts w:cs="Arial"/>
           <w:i/>
         </w:rPr>
-        <w:t>le rapport de projet</w:t>
+        <w:t>le</w:t>
+      </w:r>
+      <w:proofErr w:type="gramEnd"/>
+      <w:r>
+        <w:rPr>
+          <w:rFonts w:cs="Arial"/>
+          <w:i/>
+        </w:rPr>
+        <w:t xml:space="preserve"> rapport de projet</w:t>
       </w:r>
     </w:p>
     <w:p>
@@ -9167,12 +9502,21 @@
           <w:i/>
         </w:rPr>
       </w:pPr>
+      <w:proofErr w:type="gramStart"/>
       <w:r>
         <w:rPr>
           <w:rFonts w:cs="Arial"/>
           <w:i/>
         </w:rPr>
-        <w:t>le manuel d'Installation (en annexe)</w:t>
+        <w:t>le</w:t>
+      </w:r>
+      <w:proofErr w:type="gramEnd"/>
+      <w:r>
+        <w:rPr>
+          <w:rFonts w:cs="Arial"/>
+          <w:i/>
+        </w:rPr>
+        <w:t xml:space="preserve"> manuel d'Installation (en annexe)</w:t>
       </w:r>
     </w:p>
     <w:p>
@@ -9186,12 +9530,21 @@
           <w:i/>
         </w:rPr>
       </w:pPr>
+      <w:proofErr w:type="gramStart"/>
       <w:r>
         <w:rPr>
           <w:rFonts w:cs="Arial"/>
           <w:i/>
         </w:rPr>
-        <w:t>le manuel d'Utilisation avec des exemples graphiques (en annexe)</w:t>
+        <w:t>le</w:t>
+      </w:r>
+      <w:proofErr w:type="gramEnd"/>
+      <w:r>
+        <w:rPr>
+          <w:rFonts w:cs="Arial"/>
+          <w:i/>
+        </w:rPr>
+        <w:t xml:space="preserve"> manuel d'Utilisation avec des exemples graphiques (en annexe)</w:t>
       </w:r>
     </w:p>
     <w:p>
@@ -9205,20 +9558,246 @@
           <w:i/>
         </w:rPr>
       </w:pPr>
+      <w:proofErr w:type="gramStart"/>
       <w:r>
         <w:rPr>
           <w:rFonts w:cs="Arial"/>
           <w:i/>
         </w:rPr>
-        <w:t>autres…</w:t>
-      </w:r>
-    </w:p>
-    <w:p>
-      <w:pPr>
-        <w:rPr>
-          <w:szCs w:val="14"/>
-        </w:rPr>
-      </w:pPr>
+        <w:t>autres</w:t>
+      </w:r>
+      <w:proofErr w:type="gramEnd"/>
+      <w:r>
+        <w:rPr>
+          <w:rFonts w:cs="Arial"/>
+          <w:i/>
+        </w:rPr>
+        <w:t>…</w:t>
+      </w:r>
+    </w:p>
+    <w:p>
+      <w:pPr>
+        <w:pStyle w:val="Titre2"/>
+        <w:rPr>
+          <w:i w:val="0"/>
+          <w:iCs/>
+        </w:rPr>
+      </w:pPr>
+      <w:r>
+        <w:rPr>
+          <w:i w:val="0"/>
+          <w:iCs/>
+        </w:rPr>
+        <w:lastRenderedPageBreak/>
+        <w:t>Utilisation de l’IA</w:t>
+      </w:r>
+    </w:p>
+    <w:p>
+      <w:pPr>
+        <w:pStyle w:val="Titre3"/>
+      </w:pPr>
+      <w:r>
+        <w:t xml:space="preserve">Version écrit par </w:t>
+      </w:r>
+      <w:proofErr w:type="spellStart"/>
+      <w:r>
+        <w:t>moi-meme</w:t>
+      </w:r>
+      <w:proofErr w:type="spellEnd"/>
+    </w:p>
+    <w:p/>
+    <w:p>
+      <w:pPr>
+        <w:ind w:left="708"/>
+        <w:rPr>
+          <w:rFonts w:cs="Arial"/>
+          <w:iCs/>
+        </w:rPr>
+      </w:pPr>
+      <w:r>
+        <w:rPr>
+          <w:rFonts w:cs="Arial"/>
+          <w:iCs/>
+        </w:rPr>
+        <w:t xml:space="preserve">Personnellement j’ai une vision de l’IA d’une technologie révolutionnaire pour mon métier. Plein de technologie ont bouleverser des métiers mais dans l’informatique celui-là est très violent. Pendant mon stage de 1 ans pour réaliser des programmes « simple » l’IA ma prouvé qu’il le fessait 100x plus vite que moi. Mais à la fin du stage comme je disais « Je ne sais plus coder » j’ai dû me remémorer des taches que je fessais sur un coup de tête avant. L’utilisation de l’IA est pour moi dangereuse car on ne fait plus les choses simples qu’on en oublie plus tard de comment les faires. Du coup c’est un gain de temps énorme. Pour ce projet je vais me permettre d’utiliser l’IA pour avoir des explications mais pas pour coder car pour le PAPRO1 je dois essayer de prendre en main </w:t>
+      </w:r>
+      <w:proofErr w:type="spellStart"/>
+      <w:r>
+        <w:rPr>
+          <w:rFonts w:cs="Arial"/>
+          <w:iCs/>
+        </w:rPr>
+        <w:t>react</w:t>
+      </w:r>
+      <w:proofErr w:type="spellEnd"/>
+      <w:r>
+        <w:rPr>
+          <w:rFonts w:cs="Arial"/>
+          <w:iCs/>
+        </w:rPr>
+        <w:t xml:space="preserve"> natif puisque c’est ma première fois. Lors du TPI je me permettrai de l’utiliser pour gagne du temps sur les tâches qui peuvent être raccourci par l’IA lors de la réalisation des </w:t>
+      </w:r>
+      <w:proofErr w:type="spellStart"/>
+      <w:r>
+        <w:rPr>
+          <w:rFonts w:cs="Arial"/>
+          <w:iCs/>
+        </w:rPr>
+        <w:t>users</w:t>
+      </w:r>
+      <w:proofErr w:type="spellEnd"/>
+      <w:r>
+        <w:rPr>
+          <w:rFonts w:cs="Arial"/>
+          <w:iCs/>
+        </w:rPr>
+        <w:t xml:space="preserve"> </w:t>
+      </w:r>
+      <w:proofErr w:type="spellStart"/>
+      <w:r>
+        <w:rPr>
+          <w:rFonts w:cs="Arial"/>
+          <w:iCs/>
+        </w:rPr>
+        <w:t>storys</w:t>
+      </w:r>
+      <w:proofErr w:type="spellEnd"/>
+      <w:r>
+        <w:rPr>
+          <w:rFonts w:cs="Arial"/>
+          <w:iCs/>
+        </w:rPr>
+        <w:t>.</w:t>
+      </w:r>
+    </w:p>
+    <w:p>
+      <w:pPr>
+        <w:ind w:left="426"/>
+        <w:rPr>
+          <w:rFonts w:cs="Arial"/>
+          <w:iCs/>
+        </w:rPr>
+      </w:pPr>
+    </w:p>
+    <w:p>
+      <w:pPr>
+        <w:pStyle w:val="Titre3"/>
+      </w:pPr>
+      <w:r>
+        <w:t xml:space="preserve">Version écrite par </w:t>
+      </w:r>
+      <w:proofErr w:type="spellStart"/>
+      <w:r>
+        <w:t>ChatGPT</w:t>
+      </w:r>
+      <w:proofErr w:type="spellEnd"/>
+    </w:p>
+    <w:p/>
+    <w:p>
+      <w:pPr>
+        <w:ind w:left="708"/>
+        <w:rPr>
+          <w:rFonts w:cs="Arial"/>
+          <w:iCs/>
+        </w:rPr>
+      </w:pPr>
+      <w:r>
+        <w:rPr>
+          <w:rFonts w:cs="Arial"/>
+          <w:iCs/>
+        </w:rPr>
+        <w:t>Pour moi, l'intelligence artificielle (IA) change complètement la donne dans mon boulot. C'est incroyable comment elle peut tout faire beaucoup plus vite que nous. Par exemple, pendant mon stage d'un an où je devais coder des trucs simples, l'IA a montré qu'elle pouvait le faire 100 fois plus vite que moi. Ça m'a tellement surpris que j'ai fini par dire que j'avais "oublié comment coder" parce que je devais me rappeler comment faire des choses que je faisais facilement avant.</w:t>
+      </w:r>
+    </w:p>
+    <w:p>
+      <w:pPr>
+        <w:ind w:left="708"/>
+        <w:rPr>
+          <w:rFonts w:cs="Arial"/>
+          <w:iCs/>
+        </w:rPr>
+      </w:pPr>
+    </w:p>
+    <w:p>
+      <w:pPr>
+        <w:ind w:left="708"/>
+        <w:rPr>
+          <w:rFonts w:cs="Arial"/>
+          <w:iCs/>
+        </w:rPr>
+      </w:pPr>
+      <w:r>
+        <w:rPr>
+          <w:rFonts w:cs="Arial"/>
+          <w:iCs/>
+        </w:rPr>
+        <w:t>L'IA, c'est super pour gagner du temps, mais ça peut aussi nous faire oublier comment faire les choses par nous-mêmes. C'est un peu comme tricher à un examen : ça aide sur le moment, mais après on ne sait plus rien faire sans aide.</w:t>
+      </w:r>
+    </w:p>
+    <w:p>
+      <w:pPr>
+        <w:ind w:left="708"/>
+        <w:rPr>
+          <w:rFonts w:cs="Arial"/>
+          <w:iCs/>
+        </w:rPr>
+      </w:pPr>
+    </w:p>
+    <w:p>
+      <w:pPr>
+        <w:ind w:left="708"/>
+        <w:rPr>
+          <w:rFonts w:cs="Arial"/>
+          <w:iCs/>
+        </w:rPr>
+      </w:pPr>
+      <w:r>
+        <w:rPr>
+          <w:rFonts w:cs="Arial"/>
+          <w:iCs/>
+        </w:rPr>
+        <w:t xml:space="preserve">Quand même, je vais utiliser l'IA pour m'aider à comprendre des choses sur mon projet, mais je vais essayer de coder moi-même. Pour mon projet PAPRO1, je vais apprendre à utiliser </w:t>
+      </w:r>
+      <w:proofErr w:type="spellStart"/>
+      <w:r>
+        <w:rPr>
+          <w:rFonts w:cs="Arial"/>
+          <w:iCs/>
+        </w:rPr>
+        <w:t>React</w:t>
+      </w:r>
+      <w:proofErr w:type="spellEnd"/>
+      <w:r>
+        <w:rPr>
+          <w:rFonts w:cs="Arial"/>
+          <w:iCs/>
+        </w:rPr>
+        <w:t xml:space="preserve"> Native, quelque chose de nouveau pour moi. Et pour un autre projet, le TPI, je compte utiliser l'IA pour aller plus vite sur certaines parties, surtout pour écrire les plans de ce que je veux faire.</w:t>
+      </w:r>
+    </w:p>
+    <w:p>
+      <w:pPr>
+        <w:ind w:left="708"/>
+        <w:rPr>
+          <w:rFonts w:cs="Arial"/>
+          <w:iCs/>
+        </w:rPr>
+      </w:pPr>
+    </w:p>
+    <w:p>
+      <w:pPr>
+        <w:ind w:left="708"/>
+        <w:rPr>
+          <w:szCs w:val="14"/>
+        </w:rPr>
+      </w:pPr>
+      <w:r>
+        <w:rPr>
+          <w:rFonts w:cs="Arial"/>
+          <w:iCs/>
+        </w:rPr>
+        <w:t>Je pense que c'est un bon plan : utiliser l'IA pour aider, mais sans oublier d'apprendre et de faire les choses moi-même. C'est comme avoir un super outil qui peut faire plein de trucs, mais je veux aussi m'assurer de savoir comment les faire sans aide.</w:t>
+      </w:r>
     </w:p>
     <w:p>
       <w:pPr>
@@ -9231,7 +9810,6 @@
       <w:bookmarkStart w:id="34" w:name="_Toc71703263"/>
       <w:bookmarkStart w:id="35" w:name="_Toc499021847"/>
       <w:r>
-        <w:lastRenderedPageBreak/>
         <w:t>C</w:t>
       </w:r>
       <w:bookmarkEnd w:id="33"/>
@@ -9315,6 +9893,7 @@
           <w:rFonts w:cs="Arial"/>
           <w:i/>
         </w:rPr>
+        <w:lastRenderedPageBreak/>
         <w:t>Objectifs atteints / non-atteints</w:t>
       </w:r>
     </w:p>
@@ -9925,7 +10504,7 @@
 
 <file path=word/comments.xml><?xml version="1.0" encoding="utf-8"?>
 <w:comments xmlns:wpc="http://schemas.microsoft.com/office/word/2010/wordprocessingCanvas" xmlns:cx="http://schemas.microsoft.com/office/drawing/2014/chartex" xmlns:cx1="http://schemas.microsoft.com/office/drawing/2015/9/8/chartex" xmlns:mc="http://schemas.openxmlformats.org/markup-compatibility/2006" xmlns:o="urn:schemas-microsoft-com:office:office" xmlns:r="http://schemas.openxmlformats.org/officeDocument/2006/relationships" xmlns:m="http://schemas.openxmlformats.org/officeDocument/2006/math" xmlns:v="urn:schemas-microsoft-com:vml" xmlns:wp14="http://schemas.microsoft.com/office/word/2010/wordprocessingDrawing" xmlns:wp="http://schemas.openxmlformats.org/drawingml/2006/wordprocessingDrawing" xmlns:w10="urn:schemas-microsoft-com:office:word" xmlns:w="http://schemas.openxmlformats.org/wordprocessingml/2006/main" xmlns:w14="http://schemas.microsoft.com/office/word/2010/wordml" xmlns:w15="http://schemas.microsoft.com/office/word/2012/wordml" xmlns:w16se="http://schemas.microsoft.com/office/word/2015/wordml/symex" xmlns:wpg="http://schemas.microsoft.com/office/word/2010/wordprocessingGroup" xmlns:wpi="http://schemas.microsoft.com/office/word/2010/wordprocessingInk" xmlns:wne="http://schemas.microsoft.com/office/word/2006/wordml" xmlns:wps="http://schemas.microsoft.com/office/word/2010/wordprocessingShape" mc:Ignorable="w14 w15 w16se wp14">
-  <w:comment w:id="6" w:author="Xavier Carrel" w:date="2023-05-26T09:19:00Z" w:initials="XCL">
+  <w:comment w:id="7" w:author="Xavier Carrel" w:date="2023-05-26T09:19:00Z" w:initials="XCL">
     <w:p>
       <w:r>
         <w:rPr>
@@ -10037,7 +10616,7 @@
         <w:sz w:val="16"/>
         <w:szCs w:val="16"/>
       </w:rPr>
-      <w:t>15</w:t>
+      <w:t>7</w:t>
     </w:r>
     <w:r>
       <w:rPr>

</xml_diff>

<commit_message>
Affichages Horaires - Problèmes résolu
</commit_message>
<xml_diff>
--- a/doc/PAPRO1_2024/Rapport-PAPRO1.docx
+++ b/doc/PAPRO1_2024/Rapport-PAPRO1.docx
@@ -2951,330 +2951,35 @@
     <w:p>
       <w:pPr>
         <w:rPr>
-          <w:strike/>
-        </w:rPr>
-      </w:pPr>
-      <w:r>
-        <w:rPr>
-          <w:rStyle w:val="normaltextrun"/>
-          <w:rFonts w:cs="Arial"/>
-          <w:i/>
-          <w:iCs/>
-          <w:strike/>
-          <w:color w:val="000000"/>
-          <w:shd w:val="clear" w:color="auto" w:fill="FFFFFF"/>
-        </w:rPr>
-        <w:t>Ce chapitre montre la planification du projet. Celui-ci peut être découpé en tâches qui seront planifiées. Il s'agit de la première planification du projet, celle-ci devra être revue après l'analyse. Cette planification sera présentée sous la forme d'un diagramme.</w:t>
-      </w:r>
-      <w:r>
-        <w:rPr>
-          <w:rStyle w:val="eop"/>
-          <w:rFonts w:cs="Arial"/>
-          <w:strike/>
-          <w:color w:val="000000"/>
-          <w:shd w:val="clear" w:color="auto" w:fill="FFFFFF"/>
-        </w:rPr>
-        <w:t> </w:t>
-      </w:r>
-    </w:p>
-    <w:p>
-      <w:pPr>
-        <w:rPr>
-          <w:szCs w:val="14"/>
-        </w:rPr>
-      </w:pPr>
-    </w:p>
-    <w:p>
-      <w:pPr>
-        <w:rPr>
-          <w:b/>
-          <w:bCs/>
-          <w:i/>
-          <w:iCs/>
-          <w:color w:val="FF0000"/>
-          <w:szCs w:val="14"/>
-        </w:rPr>
-      </w:pPr>
-      <w:r>
-        <w:rPr>
-          <w:b/>
-          <w:bCs/>
-          <w:i/>
-          <w:iCs/>
-          <w:color w:val="FF0000"/>
-          <w:szCs w:val="14"/>
-        </w:rPr>
-        <w:t>Ce chapitre récapitule les dates clés (début du projet, fin, jours fériés)</w:t>
-      </w:r>
-    </w:p>
-    <w:p>
-      <w:pPr>
-        <w:rPr>
-          <w:b/>
-          <w:bCs/>
-          <w:i/>
-          <w:iCs/>
-          <w:color w:val="FF0000"/>
-          <w:szCs w:val="14"/>
-        </w:rPr>
-      </w:pPr>
-      <w:r>
-        <w:rPr>
-          <w:b/>
-          <w:bCs/>
-          <w:i/>
-          <w:iCs/>
-          <w:color w:val="FF0000"/>
-          <w:szCs w:val="14"/>
-        </w:rPr>
-        <w:t>Il donne les heures de travail d’une semaine normale.</w:t>
-      </w:r>
-    </w:p>
-    <w:p>
-      <w:pPr>
-        <w:rPr>
-          <w:b/>
-          <w:bCs/>
-          <w:i/>
-          <w:iCs/>
-          <w:color w:val="FF0000"/>
-          <w:szCs w:val="14"/>
-        </w:rPr>
-      </w:pPr>
-      <w:r>
-        <w:rPr>
-          <w:b/>
-          <w:bCs/>
-          <w:i/>
-          <w:iCs/>
-          <w:color w:val="FF0000"/>
-          <w:szCs w:val="14"/>
-        </w:rPr>
-        <w:t>Cela permet de vérifier que le temps à disposition est correct</w:t>
-      </w:r>
-    </w:p>
-    <w:p>
-      <w:pPr>
-        <w:rPr>
-          <w:b/>
-          <w:bCs/>
-          <w:i/>
-          <w:iCs/>
-          <w:color w:val="FF0000"/>
-          <w:szCs w:val="14"/>
-        </w:rPr>
-      </w:pPr>
-    </w:p>
-    <w:p>
-      <w:pPr>
-        <w:rPr>
-          <w:b/>
-          <w:bCs/>
-          <w:i/>
-          <w:iCs/>
-          <w:color w:val="FF0000"/>
-          <w:szCs w:val="14"/>
-        </w:rPr>
-      </w:pPr>
-      <w:r>
-        <w:rPr>
-          <w:b/>
-          <w:bCs/>
-          <w:i/>
-          <w:iCs/>
-          <w:color w:val="FF0000"/>
-          <w:szCs w:val="14"/>
-        </w:rPr>
-        <w:t>Il présente ensuite la découpe en sprints. Pour chacun, on a :</w:t>
-      </w:r>
-    </w:p>
-    <w:p>
-      <w:pPr>
-        <w:pStyle w:val="Paragraphedeliste"/>
-        <w:numPr>
-          <w:ilvl w:val="0"/>
-          <w:numId w:val="14"/>
-        </w:numPr>
-        <w:rPr>
-          <w:b/>
-          <w:bCs/>
-          <w:i/>
-          <w:iCs/>
-          <w:color w:val="FF0000"/>
-          <w:szCs w:val="14"/>
-        </w:rPr>
-      </w:pPr>
-      <w:r>
-        <w:rPr>
-          <w:b/>
-          <w:bCs/>
-          <w:i/>
-          <w:iCs/>
-          <w:color w:val="FF0000"/>
-          <w:szCs w:val="14"/>
-        </w:rPr>
-        <w:t>Un but</w:t>
-      </w:r>
-    </w:p>
-    <w:p>
-      <w:pPr>
-        <w:pStyle w:val="Paragraphedeliste"/>
-        <w:numPr>
-          <w:ilvl w:val="0"/>
-          <w:numId w:val="14"/>
-        </w:numPr>
-        <w:rPr>
-          <w:b/>
-          <w:bCs/>
-          <w:i/>
-          <w:iCs/>
-          <w:color w:val="FF0000"/>
-          <w:szCs w:val="14"/>
-        </w:rPr>
-      </w:pPr>
-      <w:r>
-        <w:rPr>
-          <w:b/>
-          <w:bCs/>
-          <w:i/>
-          <w:iCs/>
-          <w:color w:val="FF0000"/>
-          <w:szCs w:val="14"/>
-        </w:rPr>
-        <w:t xml:space="preserve">La date/heure de la sprint </w:t>
+          <w:iCs/>
+          <w:szCs w:val="14"/>
+        </w:rPr>
+      </w:pPr>
+      <w:r>
+        <w:rPr>
+          <w:iCs/>
+          <w:szCs w:val="14"/>
+        </w:rPr>
+        <w:t xml:space="preserve">Méthodologie utilisé : Pour ce projet j’utilise une méthode de gestion de projet Agile. La méthode </w:t>
       </w:r>
       <w:proofErr w:type="spellStart"/>
       <w:r>
         <w:rPr>
-          <w:b/>
-          <w:bCs/>
-          <w:i/>
-          <w:iCs/>
-          <w:color w:val="FF0000"/>
-          <w:szCs w:val="14"/>
-        </w:rPr>
-        <w:t>review</w:t>
+          <w:iCs/>
+          <w:szCs w:val="14"/>
+        </w:rPr>
+        <w:t>scrum</w:t>
       </w:r>
       <w:proofErr w:type="spellEnd"/>
     </w:p>
     <w:p>
       <w:pPr>
-        <w:pStyle w:val="Paragraphedeliste"/>
-        <w:numPr>
-          <w:ilvl w:val="0"/>
-          <w:numId w:val="14"/>
-        </w:numPr>
-        <w:rPr>
-          <w:b/>
-          <w:bCs/>
-          <w:i/>
-          <w:iCs/>
-          <w:color w:val="FF0000"/>
-          <w:szCs w:val="14"/>
-        </w:rPr>
-      </w:pPr>
-      <w:r>
-        <w:rPr>
-          <w:b/>
-          <w:bCs/>
-          <w:i/>
-          <w:iCs/>
-          <w:color w:val="FF0000"/>
-          <w:szCs w:val="14"/>
-        </w:rPr>
-        <w:t>Le nombre d’heure de travail</w:t>
-      </w:r>
-    </w:p>
-    <w:p>
-      <w:pPr>
-        <w:rPr>
-          <w:b/>
-          <w:bCs/>
-          <w:i/>
-          <w:iCs/>
-          <w:color w:val="FF0000"/>
-          <w:szCs w:val="14"/>
-        </w:rPr>
-      </w:pPr>
-    </w:p>
-    <w:p>
-      <w:pPr>
-        <w:rPr>
-          <w:b/>
-          <w:bCs/>
-          <w:i/>
-          <w:iCs/>
-          <w:color w:val="FF0000"/>
-          <w:szCs w:val="14"/>
-        </w:rPr>
-      </w:pPr>
-      <w:r>
-        <w:rPr>
-          <w:b/>
-          <w:bCs/>
-          <w:i/>
-          <w:iCs/>
-          <w:color w:val="FF0000"/>
-          <w:szCs w:val="14"/>
-        </w:rPr>
-        <w:t>Cette planification est établie rapidement en tout début de projet et ne peut en aucun cas être modifiée après sa publication</w:t>
-      </w:r>
-    </w:p>
-    <w:p>
-      <w:pPr>
-        <w:rPr>
-          <w:szCs w:val="14"/>
-        </w:rPr>
-      </w:pPr>
-    </w:p>
-    <w:p>
-      <w:pPr>
-        <w:rPr>
-          <w:i/>
-          <w:iCs/>
-          <w:szCs w:val="14"/>
-        </w:rPr>
-      </w:pPr>
-      <w:r>
-        <w:rPr>
-          <w:i/>
-          <w:iCs/>
-          <w:szCs w:val="14"/>
-        </w:rPr>
-        <w:t>Ces éléments peuvent être repris des</w:t>
-      </w:r>
-      <w:r>
-        <w:rPr>
-          <w:i/>
-          <w:iCs/>
-          <w:szCs w:val="14"/>
-        </w:rPr>
-        <w:t xml:space="preserve"> </w:t>
-      </w:r>
-      <w:r>
-        <w:rPr>
-          <w:i/>
-          <w:iCs/>
-          <w:szCs w:val="14"/>
-        </w:rPr>
-        <w:t>spécifications</w:t>
-      </w:r>
-      <w:r>
-        <w:rPr>
-          <w:i/>
-          <w:iCs/>
-          <w:szCs w:val="14"/>
-        </w:rPr>
-        <w:t xml:space="preserve"> </w:t>
-      </w:r>
-      <w:r>
-        <w:rPr>
-          <w:i/>
-          <w:iCs/>
-          <w:szCs w:val="14"/>
-        </w:rPr>
-        <w:t>de départ.</w:t>
-      </w:r>
+        <w:rPr>
+          <w:i/>
+          <w:iCs/>
+          <w:szCs w:val="14"/>
+        </w:rPr>
+      </w:pPr>
     </w:p>
     <w:tbl>
       <w:tblPr>
@@ -3734,7 +3439,6 @@
           <w:iCs/>
           <w:szCs w:val="14"/>
         </w:rPr>
-        <w:lastRenderedPageBreak/>
         <w:t>Heure de travail sur le projet :</w:t>
       </w:r>
     </w:p>
@@ -4094,6 +3798,7 @@
         <w:rPr>
           <w:szCs w:val="14"/>
         </w:rPr>
+        <w:lastRenderedPageBreak/>
         <w:t xml:space="preserve">Mes buts : Finir la planification, prendre en main </w:t>
       </w:r>
       <w:proofErr w:type="spellStart"/>
@@ -4163,7 +3868,13 @@
         <w:rPr>
           <w:szCs w:val="14"/>
         </w:rPr>
-        <w:t xml:space="preserve"> du sprint numéro 1 : 14H45 le 09.02.2024</w:t>
+        <w:t xml:space="preserve"> du sprint numéro 1 : 14H30 à 15H00</w:t>
+      </w:r>
+      <w:r>
+        <w:rPr>
+          <w:szCs w:val="14"/>
+        </w:rPr>
+        <w:t xml:space="preserve"> le 09.02.2024</w:t>
       </w:r>
     </w:p>
     <w:p>
@@ -4326,7 +4037,6 @@
         </w:rPr>
         <w:t xml:space="preserve">à </w:t>
       </w:r>
-      <w:proofErr w:type="gramStart"/>
       <w:r>
         <w:rPr>
           <w:rFonts w:ascii="Arial" w:hAnsi="Arial"/>
@@ -4334,9 +4044,8 @@
           <w:szCs w:val="14"/>
           <w:lang w:eastAsia="fr-FR"/>
         </w:rPr>
-        <w:t>comment  les</w:t>
-      </w:r>
-      <w:proofErr w:type="gramEnd"/>
+        <w:t>comment les</w:t>
+      </w:r>
       <w:r>
         <w:rPr>
           <w:rFonts w:ascii="Arial" w:hAnsi="Arial"/>
@@ -4344,10 +4053,8 @@
           <w:szCs w:val="14"/>
           <w:lang w:eastAsia="fr-FR"/>
         </w:rPr>
-        <w:t xml:space="preserve"> </w:t>
-      </w:r>
-      <w:bookmarkStart w:id="6" w:name="_GoBack"/>
-      <w:bookmarkEnd w:id="6"/>
+        <w:t xml:space="preserve"> intégrer</w:t>
+      </w:r>
       <w:r>
         <w:rPr>
           <w:rFonts w:ascii="Arial" w:hAnsi="Arial"/>
@@ -4355,8 +4062,19 @@
           <w:szCs w:val="14"/>
           <w:lang w:eastAsia="fr-FR"/>
         </w:rPr>
-        <w:t>intégrer</w:t>
-      </w:r>
+        <w:t xml:space="preserve"> ou les </w:t>
+      </w:r>
+      <w:proofErr w:type="spellStart"/>
+      <w:r>
+        <w:rPr>
+          <w:rFonts w:ascii="Arial" w:hAnsi="Arial"/>
+          <w:sz w:val="24"/>
+          <w:szCs w:val="14"/>
+          <w:lang w:eastAsia="fr-FR"/>
+        </w:rPr>
+        <w:t>réparers</w:t>
+      </w:r>
+      <w:proofErr w:type="spellEnd"/>
     </w:p>
     <w:p>
       <w:pPr>
@@ -4384,45 +4102,29 @@
         <w:ind w:left="360"/>
         <w:rPr>
           <w:rFonts w:ascii="Arial" w:hAnsi="Arial"/>
-          <w:i/>
-          <w:iCs/>
-          <w:sz w:val="24"/>
-          <w:szCs w:val="24"/>
+          <w:sz w:val="24"/>
+          <w:szCs w:val="14"/>
           <w:lang w:eastAsia="fr-FR"/>
         </w:rPr>
       </w:pPr>
       <w:r>
         <w:rPr>
           <w:rFonts w:ascii="Arial" w:hAnsi="Arial"/>
-          <w:i/>
-          <w:iCs/>
-          <w:sz w:val="24"/>
-          <w:szCs w:val="24"/>
+          <w:b/>
+          <w:sz w:val="24"/>
+          <w:szCs w:val="14"/>
           <w:lang w:eastAsia="fr-FR"/>
         </w:rPr>
-        <w:t>Le concept</w:t>
+        <w:t>User story (Affichage des horaires)</w:t>
       </w:r>
       <w:r>
         <w:rPr>
           <w:rFonts w:ascii="Arial" w:hAnsi="Arial"/>
-          <w:i/>
-          <w:iCs/>
-          <w:sz w:val="24"/>
-          <w:szCs w:val="24"/>
+          <w:sz w:val="24"/>
+          <w:szCs w:val="14"/>
           <w:lang w:eastAsia="fr-FR"/>
         </w:rPr>
-        <w:t xml:space="preserve"> complet avec toutes ses </w:t>
-      </w:r>
-      <w:r>
-        <w:rPr>
-          <w:rFonts w:ascii="Arial" w:hAnsi="Arial"/>
-          <w:i/>
-          <w:iCs/>
-          <w:sz w:val="24"/>
-          <w:szCs w:val="24"/>
-          <w:lang w:eastAsia="fr-FR"/>
-        </w:rPr>
-        <w:t>annexes :</w:t>
+        <w:t xml:space="preserve"> : </w:t>
       </w:r>
     </w:p>
     <w:p>
@@ -4435,8 +4137,6 @@
         <w:ind w:left="360"/>
         <w:rPr>
           <w:rFonts w:ascii="Arial" w:hAnsi="Arial"/>
-          <w:i/>
-          <w:iCs/>
           <w:sz w:val="24"/>
           <w:szCs w:val="14"/>
           <w:lang w:eastAsia="fr-FR"/>
@@ -4453,9 +4153,6 @@
         <w:ind w:left="360"/>
         <w:rPr>
           <w:rFonts w:ascii="Arial" w:hAnsi="Arial"/>
-          <w:i/>
-          <w:iCs/>
-          <w:color w:val="FF0000"/>
           <w:sz w:val="24"/>
           <w:szCs w:val="14"/>
           <w:lang w:eastAsia="fr-FR"/>
@@ -4464,174 +4161,11 @@
       <w:r>
         <w:rPr>
           <w:rFonts w:ascii="Arial" w:hAnsi="Arial"/>
-          <w:i/>
-          <w:iCs/>
-          <w:color w:val="FF0000"/>
           <w:sz w:val="24"/>
           <w:szCs w:val="14"/>
           <w:lang w:eastAsia="fr-FR"/>
         </w:rPr>
-        <w:t>Au minimum :</w:t>
-      </w:r>
-    </w:p>
-    <w:p>
-      <w:pPr>
-        <w:pStyle w:val="Retraitnormal1"/>
-        <w:numPr>
-          <w:ilvl w:val="0"/>
-          <w:numId w:val="15"/>
-        </w:numPr>
-        <w:rPr>
-          <w:rFonts w:ascii="Arial" w:hAnsi="Arial"/>
-          <w:i/>
-          <w:iCs/>
-          <w:color w:val="FF0000"/>
-          <w:sz w:val="24"/>
-          <w:szCs w:val="14"/>
-          <w:lang w:eastAsia="fr-FR"/>
-        </w:rPr>
-      </w:pPr>
-      <w:r>
-        <w:rPr>
-          <w:rFonts w:ascii="Arial" w:hAnsi="Arial"/>
-          <w:i/>
-          <w:iCs/>
-          <w:color w:val="FF0000"/>
-          <w:sz w:val="24"/>
-          <w:szCs w:val="14"/>
-          <w:lang w:eastAsia="fr-FR"/>
-        </w:rPr>
-        <w:t>Un ou plusieurs schémas de contexte montrant le système dans son environnement d’utilisation, ainsi que ses utilisateurs. Ce type schéma doit être accompagné d’explications textuelles</w:t>
-      </w:r>
-    </w:p>
-    <w:p>
-      <w:pPr>
-        <w:pStyle w:val="Retraitnormal1"/>
-        <w:numPr>
-          <w:ilvl w:val="0"/>
-          <w:numId w:val="15"/>
-        </w:numPr>
-        <w:rPr>
-          <w:rFonts w:ascii="Arial" w:hAnsi="Arial"/>
-          <w:i/>
-          <w:iCs/>
-          <w:color w:val="FF0000"/>
-          <w:sz w:val="24"/>
-          <w:szCs w:val="14"/>
-          <w:lang w:eastAsia="fr-FR"/>
-        </w:rPr>
-      </w:pPr>
-      <w:r>
-        <w:rPr>
-          <w:rFonts w:ascii="Arial" w:hAnsi="Arial"/>
-          <w:i/>
-          <w:iCs/>
-          <w:color w:val="FF0000"/>
-          <w:sz w:val="24"/>
-          <w:szCs w:val="14"/>
-          <w:lang w:eastAsia="fr-FR"/>
-        </w:rPr>
-        <w:t xml:space="preserve">Un ou plusieurs schémas d’architecture montrant la structure </w:t>
-      </w:r>
-      <w:r>
-        <w:rPr>
-          <w:rFonts w:ascii="Arial" w:hAnsi="Arial"/>
-          <w:i/>
-          <w:iCs/>
-          <w:color w:val="FF0000"/>
-          <w:sz w:val="24"/>
-          <w:szCs w:val="14"/>
-          <w:lang w:eastAsia="fr-FR"/>
-        </w:rPr>
-        <w:t xml:space="preserve">interne </w:t>
-      </w:r>
-      <w:r>
-        <w:rPr>
-          <w:rFonts w:ascii="Arial" w:hAnsi="Arial"/>
-          <w:i/>
-          <w:iCs/>
-          <w:color w:val="FF0000"/>
-          <w:sz w:val="24"/>
-          <w:szCs w:val="14"/>
-          <w:lang w:eastAsia="fr-FR"/>
-        </w:rPr>
-        <w:t>du système. Ce type schéma doit être accompagné d’explications textuelles</w:t>
-      </w:r>
-    </w:p>
-    <w:p>
-      <w:pPr>
-        <w:pStyle w:val="Retraitnormal1"/>
-        <w:numPr>
-          <w:ilvl w:val="0"/>
-          <w:numId w:val="15"/>
-        </w:numPr>
-        <w:rPr>
-          <w:rFonts w:ascii="Arial" w:hAnsi="Arial"/>
-          <w:i/>
-          <w:iCs/>
-          <w:color w:val="FF0000"/>
-          <w:sz w:val="24"/>
-          <w:szCs w:val="14"/>
-          <w:lang w:eastAsia="fr-FR"/>
-        </w:rPr>
-      </w:pPr>
-      <w:r>
-        <w:rPr>
-          <w:rFonts w:ascii="Arial" w:hAnsi="Arial"/>
-          <w:i/>
-          <w:iCs/>
-          <w:color w:val="FF0000"/>
-          <w:sz w:val="24"/>
-          <w:szCs w:val="14"/>
-          <w:lang w:eastAsia="fr-FR"/>
-        </w:rPr>
-        <w:t>Un modèle conceptuel des données</w:t>
-      </w:r>
-      <w:r>
-        <w:rPr>
-          <w:rFonts w:ascii="Arial" w:hAnsi="Arial"/>
-          <w:i/>
-          <w:iCs/>
-          <w:color w:val="FF0000"/>
-          <w:sz w:val="24"/>
-          <w:szCs w:val="14"/>
-          <w:lang w:eastAsia="fr-FR"/>
-        </w:rPr>
-        <w:t xml:space="preserve">, accompagné d’une explication pour chaque entité/attribut possédant une </w:t>
-      </w:r>
-      <w:commentRangeStart w:id="7"/>
-      <w:r>
-        <w:rPr>
-          <w:rFonts w:ascii="Arial" w:hAnsi="Arial"/>
-          <w:i/>
-          <w:iCs/>
-          <w:color w:val="FF0000"/>
-          <w:sz w:val="24"/>
-          <w:szCs w:val="14"/>
-          <w:lang w:eastAsia="fr-FR"/>
-        </w:rPr>
-        <w:t>particularité</w:t>
-      </w:r>
-      <w:commentRangeEnd w:id="7"/>
-      <w:r>
-        <w:rPr>
-          <w:rStyle w:val="Marquedecommentaire"/>
-          <w:rFonts w:ascii="Arial" w:hAnsi="Arial"/>
-          <w:lang w:eastAsia="fr-FR"/>
-        </w:rPr>
-        <w:commentReference w:id="7"/>
-      </w:r>
-      <w:r>
-        <w:rPr>
-          <w:rFonts w:ascii="Arial" w:hAnsi="Arial"/>
-          <w:i/>
-          <w:iCs/>
-          <w:color w:val="FF0000"/>
-          <w:sz w:val="24"/>
-          <w:szCs w:val="14"/>
-          <w:lang w:eastAsia="fr-FR"/>
-        </w:rPr>
-        <w:t>.</w:t>
+        <w:t>Problème lié à l’affichage des horaires sur l’image ci-dessous : on peut voir que l’horaire finit à 16h00 alors qu'il se termine normalement à 16h30. Un problème a été détecté et doit être réglé.</w:t>
       </w:r>
     </w:p>
     <w:p>
@@ -4644,9 +4178,6 @@
         <w:ind w:left="360"/>
         <w:rPr>
           <w:rFonts w:ascii="Arial" w:hAnsi="Arial"/>
-          <w:i/>
-          <w:iCs/>
-          <w:color w:val="FF0000"/>
           <w:sz w:val="24"/>
           <w:szCs w:val="14"/>
           <w:lang w:eastAsia="fr-FR"/>
@@ -4661,6 +4192,869 @@
           <w:numId w:val="0"/>
         </w:numPr>
         <w:ind w:left="360"/>
+        <w:jc w:val="center"/>
+        <w:rPr>
+          <w:rFonts w:ascii="Arial" w:hAnsi="Arial"/>
+          <w:sz w:val="24"/>
+          <w:szCs w:val="14"/>
+          <w:lang w:eastAsia="fr-FR"/>
+        </w:rPr>
+      </w:pPr>
+      <w:r>
+        <w:rPr>
+          <w:noProof/>
+          <w:lang w:val="fr-CH"/>
+        </w:rPr>
+        <w:drawing>
+          <wp:inline distT="0" distB="0" distL="0" distR="0" wp14:anchorId="00F70CAA" wp14:editId="6097E1C5">
+            <wp:extent cx="1762125" cy="3056647"/>
+            <wp:effectExtent l="0" t="0" r="0" b="0"/>
+            <wp:docPr id="3" name="Image 3"/>
+            <wp:cNvGraphicFramePr>
+              <a:graphicFrameLocks xmlns:a="http://schemas.openxmlformats.org/drawingml/2006/main" noChangeAspect="1"/>
+            </wp:cNvGraphicFramePr>
+            <a:graphic xmlns:a="http://schemas.openxmlformats.org/drawingml/2006/main">
+              <a:graphicData uri="http://schemas.openxmlformats.org/drawingml/2006/picture">
+                <pic:pic xmlns:pic="http://schemas.openxmlformats.org/drawingml/2006/picture">
+                  <pic:nvPicPr>
+                    <pic:cNvPr id="1" name=""/>
+                    <pic:cNvPicPr/>
+                  </pic:nvPicPr>
+                  <pic:blipFill>
+                    <a:blip r:embed="rId11"/>
+                    <a:stretch>
+                      <a:fillRect/>
+                    </a:stretch>
+                  </pic:blipFill>
+                  <pic:spPr>
+                    <a:xfrm>
+                      <a:off x="0" y="0"/>
+                      <a:ext cx="1765619" cy="3062708"/>
+                    </a:xfrm>
+                    <a:prstGeom prst="rect">
+                      <a:avLst/>
+                    </a:prstGeom>
+                  </pic:spPr>
+                </pic:pic>
+              </a:graphicData>
+            </a:graphic>
+          </wp:inline>
+        </w:drawing>
+      </w:r>
+    </w:p>
+    <w:p>
+      <w:pPr>
+        <w:pStyle w:val="Retraitnormal1"/>
+        <w:numPr>
+          <w:ilvl w:val="0"/>
+          <w:numId w:val="0"/>
+        </w:numPr>
+        <w:ind w:left="360"/>
+        <w:jc w:val="center"/>
+        <w:rPr>
+          <w:rFonts w:ascii="Arial" w:hAnsi="Arial"/>
+          <w:sz w:val="24"/>
+          <w:szCs w:val="14"/>
+          <w:lang w:eastAsia="fr-FR"/>
+        </w:rPr>
+      </w:pPr>
+    </w:p>
+    <w:p>
+      <w:pPr>
+        <w:pStyle w:val="Retraitnormal1"/>
+        <w:numPr>
+          <w:ilvl w:val="0"/>
+          <w:numId w:val="0"/>
+        </w:numPr>
+        <w:ind w:left="360"/>
+        <w:rPr>
+          <w:rFonts w:ascii="Arial" w:hAnsi="Arial"/>
+          <w:sz w:val="24"/>
+          <w:szCs w:val="14"/>
+          <w:lang w:eastAsia="fr-FR"/>
+        </w:rPr>
+      </w:pPr>
+      <w:r>
+        <w:rPr>
+          <w:rFonts w:ascii="Arial" w:hAnsi="Arial"/>
+          <w:sz w:val="24"/>
+          <w:szCs w:val="14"/>
+          <w:lang w:eastAsia="fr-FR"/>
+        </w:rPr>
+        <w:t>Le problème est inconnu, mais je pense premièrement que cela doit être lié à un problème avec la taille du composant. La première étape sera de trouver où se trouve le composant et de voir si le problème est lié à sa taille. Une autre possibilité est que l’API ne retourne pas correctement les données inscrites. Pour ce faire, j’aurai besoin de trouver le composant et d’inscrire l’horaire sur les composants comme sur l’image ci-dessus. Comme on peut le voir, le problème n'est pas lié à l’API, mais à son affichage.</w:t>
+      </w:r>
+    </w:p>
+    <w:p>
+      <w:pPr>
+        <w:pStyle w:val="Retraitnormal1"/>
+        <w:numPr>
+          <w:ilvl w:val="0"/>
+          <w:numId w:val="0"/>
+        </w:numPr>
+        <w:ind w:left="360"/>
+        <w:rPr>
+          <w:rFonts w:ascii="Arial" w:hAnsi="Arial"/>
+          <w:sz w:val="24"/>
+          <w:szCs w:val="14"/>
+          <w:lang w:eastAsia="fr-FR"/>
+        </w:rPr>
+      </w:pPr>
+    </w:p>
+    <w:p>
+      <w:pPr>
+        <w:pStyle w:val="Retraitnormal1"/>
+        <w:numPr>
+          <w:ilvl w:val="0"/>
+          <w:numId w:val="0"/>
+        </w:numPr>
+        <w:ind w:left="360"/>
+        <w:rPr>
+          <w:rFonts w:ascii="Arial" w:hAnsi="Arial"/>
+          <w:sz w:val="24"/>
+          <w:szCs w:val="14"/>
+          <w:lang w:eastAsia="fr-FR"/>
+        </w:rPr>
+      </w:pPr>
+      <w:r>
+        <w:rPr>
+          <w:rFonts w:ascii="Arial" w:hAnsi="Arial"/>
+          <w:b/>
+          <w:sz w:val="24"/>
+          <w:szCs w:val="14"/>
+          <w:lang w:eastAsia="fr-FR"/>
+        </w:rPr>
+        <w:lastRenderedPageBreak/>
+        <w:t>User story (</w:t>
+      </w:r>
+      <w:r>
+        <w:rPr>
+          <w:rFonts w:ascii="Arial" w:hAnsi="Arial"/>
+          <w:b/>
+          <w:sz w:val="24"/>
+          <w:szCs w:val="14"/>
+          <w:lang w:eastAsia="fr-FR"/>
+        </w:rPr>
+        <w:t xml:space="preserve">Mettre en évidence les </w:t>
+      </w:r>
+      <w:proofErr w:type="spellStart"/>
+      <w:r>
+        <w:rPr>
+          <w:rFonts w:ascii="Arial" w:hAnsi="Arial"/>
+          <w:b/>
+          <w:sz w:val="24"/>
+          <w:szCs w:val="14"/>
+          <w:lang w:eastAsia="fr-FR"/>
+        </w:rPr>
+        <w:t>runs</w:t>
+      </w:r>
+      <w:proofErr w:type="spellEnd"/>
+      <w:r>
+        <w:rPr>
+          <w:rFonts w:ascii="Arial" w:hAnsi="Arial"/>
+          <w:b/>
+          <w:sz w:val="24"/>
+          <w:szCs w:val="14"/>
+          <w:lang w:eastAsia="fr-FR"/>
+        </w:rPr>
+        <w:t xml:space="preserve"> qui sont en manque de chauffeurs</w:t>
+      </w:r>
+      <w:r>
+        <w:rPr>
+          <w:rFonts w:ascii="Arial" w:hAnsi="Arial"/>
+          <w:b/>
+          <w:sz w:val="24"/>
+          <w:szCs w:val="14"/>
+          <w:lang w:eastAsia="fr-FR"/>
+        </w:rPr>
+        <w:t>)</w:t>
+      </w:r>
+      <w:r>
+        <w:rPr>
+          <w:rFonts w:ascii="Arial" w:hAnsi="Arial"/>
+          <w:sz w:val="24"/>
+          <w:szCs w:val="14"/>
+          <w:lang w:eastAsia="fr-FR"/>
+        </w:rPr>
+        <w:t xml:space="preserve"> : </w:t>
+      </w:r>
+    </w:p>
+    <w:p>
+      <w:pPr>
+        <w:pStyle w:val="Retraitnormal1"/>
+        <w:numPr>
+          <w:ilvl w:val="0"/>
+          <w:numId w:val="0"/>
+        </w:numPr>
+        <w:ind w:left="360"/>
+        <w:rPr>
+          <w:rFonts w:ascii="Arial" w:hAnsi="Arial"/>
+          <w:sz w:val="24"/>
+          <w:szCs w:val="14"/>
+          <w:lang w:eastAsia="fr-FR"/>
+        </w:rPr>
+      </w:pPr>
+    </w:p>
+    <w:p>
+      <w:pPr>
+        <w:pStyle w:val="Retraitnormal1"/>
+        <w:numPr>
+          <w:ilvl w:val="0"/>
+          <w:numId w:val="0"/>
+        </w:numPr>
+        <w:ind w:left="360"/>
+        <w:rPr>
+          <w:rFonts w:ascii="Arial" w:hAnsi="Arial"/>
+          <w:sz w:val="24"/>
+          <w:szCs w:val="14"/>
+          <w:lang w:eastAsia="fr-FR"/>
+        </w:rPr>
+      </w:pPr>
+      <w:r>
+        <w:rPr>
+          <w:rFonts w:ascii="Arial" w:hAnsi="Arial"/>
+          <w:sz w:val="24"/>
+          <w:szCs w:val="14"/>
+          <w:lang w:eastAsia="fr-FR"/>
+        </w:rPr>
+        <w:t>Tâches liées à l’affichage et à la mise en évidence d'un composant. En français, on peut dire que je dois changer la couleur d'un carré sur l'application lorsqu'il manque un chauffeur. Pour ce faire, je devrai probablement seulement trouver le composant, identifier la condition et modifier la couleur en fonction de la condition.</w:t>
+      </w:r>
+    </w:p>
+    <w:p>
+      <w:pPr>
+        <w:pStyle w:val="Retraitnormal1"/>
+        <w:numPr>
+          <w:ilvl w:val="0"/>
+          <w:numId w:val="0"/>
+        </w:numPr>
+        <w:ind w:left="360"/>
+        <w:rPr>
+          <w:rFonts w:ascii="Arial" w:hAnsi="Arial"/>
+          <w:sz w:val="24"/>
+          <w:szCs w:val="14"/>
+          <w:lang w:eastAsia="fr-FR"/>
+        </w:rPr>
+      </w:pPr>
+    </w:p>
+    <w:p>
+      <w:pPr>
+        <w:pStyle w:val="Retraitnormal1"/>
+        <w:numPr>
+          <w:ilvl w:val="0"/>
+          <w:numId w:val="0"/>
+        </w:numPr>
+        <w:ind w:left="360"/>
+        <w:rPr>
+          <w:rFonts w:ascii="Arial" w:hAnsi="Arial"/>
+          <w:sz w:val="24"/>
+          <w:szCs w:val="14"/>
+          <w:lang w:eastAsia="fr-FR"/>
+        </w:rPr>
+      </w:pPr>
+      <w:r>
+        <w:rPr>
+          <w:rFonts w:ascii="Arial" w:hAnsi="Arial"/>
+          <w:b/>
+          <w:sz w:val="24"/>
+          <w:szCs w:val="14"/>
+          <w:lang w:eastAsia="fr-FR"/>
+        </w:rPr>
+        <w:t>User story (</w:t>
+      </w:r>
+      <w:r>
+        <w:rPr>
+          <w:rFonts w:ascii="Arial" w:hAnsi="Arial"/>
+          <w:b/>
+          <w:sz w:val="24"/>
+          <w:szCs w:val="14"/>
+          <w:lang w:eastAsia="fr-FR"/>
+        </w:rPr>
+        <w:t xml:space="preserve">Rafraichissement de la page lorsque </w:t>
+      </w:r>
+      <w:proofErr w:type="spellStart"/>
+      <w:r>
+        <w:rPr>
+          <w:rFonts w:ascii="Arial" w:hAnsi="Arial"/>
+          <w:b/>
+          <w:sz w:val="24"/>
+          <w:szCs w:val="14"/>
+          <w:lang w:eastAsia="fr-FR"/>
+        </w:rPr>
+        <w:t>l’app</w:t>
+      </w:r>
+      <w:proofErr w:type="spellEnd"/>
+      <w:r>
+        <w:rPr>
+          <w:rFonts w:ascii="Arial" w:hAnsi="Arial"/>
+          <w:b/>
+          <w:sz w:val="24"/>
+          <w:szCs w:val="14"/>
+          <w:lang w:eastAsia="fr-FR"/>
+        </w:rPr>
+        <w:t xml:space="preserve"> a le focus</w:t>
+      </w:r>
+      <w:r>
+        <w:rPr>
+          <w:rFonts w:ascii="Arial" w:hAnsi="Arial"/>
+          <w:b/>
+          <w:sz w:val="24"/>
+          <w:szCs w:val="14"/>
+          <w:lang w:eastAsia="fr-FR"/>
+        </w:rPr>
+        <w:t>)</w:t>
+      </w:r>
+      <w:r>
+        <w:rPr>
+          <w:rFonts w:ascii="Arial" w:hAnsi="Arial"/>
+          <w:sz w:val="24"/>
+          <w:szCs w:val="14"/>
+          <w:lang w:eastAsia="fr-FR"/>
+        </w:rPr>
+        <w:t> :</w:t>
+      </w:r>
+    </w:p>
+    <w:p>
+      <w:pPr>
+        <w:pStyle w:val="Retraitnormal1"/>
+        <w:numPr>
+          <w:ilvl w:val="0"/>
+          <w:numId w:val="0"/>
+        </w:numPr>
+        <w:ind w:left="360"/>
+        <w:rPr>
+          <w:rFonts w:ascii="Arial" w:hAnsi="Arial"/>
+          <w:sz w:val="24"/>
+          <w:szCs w:val="14"/>
+          <w:lang w:eastAsia="fr-FR"/>
+        </w:rPr>
+      </w:pPr>
+    </w:p>
+    <w:p>
+      <w:pPr>
+        <w:pStyle w:val="Retraitnormal1"/>
+        <w:numPr>
+          <w:ilvl w:val="0"/>
+          <w:numId w:val="0"/>
+        </w:numPr>
+        <w:ind w:left="360"/>
+        <w:rPr>
+          <w:rFonts w:ascii="Arial" w:hAnsi="Arial"/>
+          <w:sz w:val="24"/>
+          <w:szCs w:val="14"/>
+          <w:lang w:eastAsia="fr-FR"/>
+        </w:rPr>
+      </w:pPr>
+      <w:r>
+        <w:rPr>
+          <w:rFonts w:ascii="Arial" w:hAnsi="Arial"/>
+          <w:sz w:val="24"/>
+          <w:szCs w:val="14"/>
+          <w:lang w:eastAsia="fr-FR"/>
+        </w:rPr>
+        <w:t xml:space="preserve">Problèmes liés à l’utilisation de l’application. Les utilisateurs utilisent trop le rafraîchissement manuel. On doit mettre cette option automatiquement. Pour ce faire, je devrai sûrement trouver l’événement ou un </w:t>
+      </w:r>
+      <w:r>
+        <w:rPr>
+          <w:rFonts w:ascii="Arial" w:hAnsi="Arial"/>
+          <w:sz w:val="24"/>
+          <w:szCs w:val="14"/>
+          <w:lang w:eastAsia="fr-FR"/>
+        </w:rPr>
+        <w:t>state</w:t>
+      </w:r>
+      <w:r>
+        <w:rPr>
+          <w:rFonts w:ascii="Arial" w:hAnsi="Arial"/>
+          <w:sz w:val="24"/>
+          <w:szCs w:val="14"/>
+          <w:lang w:eastAsia="fr-FR"/>
+        </w:rPr>
+        <w:t xml:space="preserve"> qui devra effectuer la tâche de rafraîchir la page. Cette tâche devra sûrement se faire sur la page </w:t>
+      </w:r>
+      <w:proofErr w:type="spellStart"/>
+      <w:r>
+        <w:rPr>
+          <w:rFonts w:ascii="Arial" w:hAnsi="Arial"/>
+          <w:sz w:val="24"/>
+          <w:szCs w:val="14"/>
+          <w:lang w:eastAsia="fr-FR"/>
+        </w:rPr>
+        <w:t>app.tsx</w:t>
+      </w:r>
+      <w:proofErr w:type="spellEnd"/>
+      <w:r>
+        <w:rPr>
+          <w:rFonts w:ascii="Arial" w:hAnsi="Arial"/>
+          <w:sz w:val="24"/>
+          <w:szCs w:val="14"/>
+          <w:lang w:eastAsia="fr-FR"/>
+        </w:rPr>
+        <w:t xml:space="preserve"> car c’est le composant parent qui mettra à jour tous les composants enfants.</w:t>
+      </w:r>
+    </w:p>
+    <w:p>
+      <w:pPr>
+        <w:pStyle w:val="Retraitnormal1"/>
+        <w:numPr>
+          <w:ilvl w:val="0"/>
+          <w:numId w:val="0"/>
+        </w:numPr>
+        <w:ind w:left="360"/>
+        <w:rPr>
+          <w:rFonts w:ascii="Arial" w:hAnsi="Arial"/>
+          <w:sz w:val="24"/>
+          <w:szCs w:val="14"/>
+          <w:lang w:eastAsia="fr-FR"/>
+        </w:rPr>
+      </w:pPr>
+      <w:r>
+        <w:rPr>
+          <w:rFonts w:ascii="Arial" w:hAnsi="Arial"/>
+          <w:sz w:val="24"/>
+          <w:szCs w:val="14"/>
+          <w:lang w:eastAsia="fr-FR"/>
+        </w:rPr>
+        <w:t xml:space="preserve"> </w:t>
+      </w:r>
+    </w:p>
+    <w:p>
+      <w:pPr>
+        <w:pStyle w:val="Retraitnormal1"/>
+        <w:numPr>
+          <w:ilvl w:val="0"/>
+          <w:numId w:val="0"/>
+        </w:numPr>
+        <w:ind w:left="360"/>
+        <w:rPr>
+          <w:rFonts w:ascii="Arial" w:hAnsi="Arial"/>
+          <w:sz w:val="24"/>
+          <w:szCs w:val="14"/>
+          <w:lang w:eastAsia="fr-FR"/>
+        </w:rPr>
+      </w:pPr>
+      <w:r>
+        <w:rPr>
+          <w:rFonts w:ascii="Arial" w:hAnsi="Arial"/>
+          <w:b/>
+          <w:sz w:val="24"/>
+          <w:szCs w:val="14"/>
+          <w:lang w:eastAsia="fr-FR"/>
+        </w:rPr>
+        <w:t>User story (</w:t>
+      </w:r>
+      <w:r>
+        <w:rPr>
+          <w:rFonts w:ascii="Arial" w:hAnsi="Arial"/>
+          <w:b/>
+          <w:sz w:val="24"/>
+          <w:szCs w:val="14"/>
+          <w:lang w:eastAsia="fr-FR"/>
+        </w:rPr>
+        <w:t xml:space="preserve">Ajouter l’heure du prochain </w:t>
+      </w:r>
+      <w:proofErr w:type="spellStart"/>
+      <w:r>
+        <w:rPr>
+          <w:rFonts w:ascii="Arial" w:hAnsi="Arial"/>
+          <w:b/>
+          <w:sz w:val="24"/>
+          <w:szCs w:val="14"/>
+          <w:lang w:eastAsia="fr-FR"/>
+        </w:rPr>
+        <w:t>run</w:t>
+      </w:r>
+      <w:proofErr w:type="spellEnd"/>
+      <w:r>
+        <w:rPr>
+          <w:rFonts w:ascii="Arial" w:hAnsi="Arial"/>
+          <w:b/>
+          <w:sz w:val="24"/>
+          <w:szCs w:val="14"/>
+          <w:lang w:eastAsia="fr-FR"/>
+        </w:rPr>
+        <w:t xml:space="preserve"> pour chaque véhicule</w:t>
+      </w:r>
+      <w:r>
+        <w:rPr>
+          <w:rFonts w:ascii="Arial" w:hAnsi="Arial"/>
+          <w:b/>
+          <w:sz w:val="24"/>
+          <w:szCs w:val="14"/>
+          <w:lang w:eastAsia="fr-FR"/>
+        </w:rPr>
+        <w:t>)</w:t>
+      </w:r>
+      <w:r>
+        <w:rPr>
+          <w:rFonts w:ascii="Arial" w:hAnsi="Arial"/>
+          <w:sz w:val="24"/>
+          <w:szCs w:val="14"/>
+          <w:lang w:eastAsia="fr-FR"/>
+        </w:rPr>
+        <w:t> :</w:t>
+      </w:r>
+    </w:p>
+    <w:p>
+      <w:pPr>
+        <w:pStyle w:val="Retraitnormal1"/>
+        <w:numPr>
+          <w:ilvl w:val="0"/>
+          <w:numId w:val="0"/>
+        </w:numPr>
+        <w:ind w:left="360"/>
+        <w:rPr>
+          <w:rFonts w:ascii="Arial" w:hAnsi="Arial"/>
+          <w:sz w:val="24"/>
+          <w:szCs w:val="14"/>
+          <w:lang w:eastAsia="fr-FR"/>
+        </w:rPr>
+      </w:pPr>
+    </w:p>
+    <w:p>
+      <w:pPr>
+        <w:pStyle w:val="Retraitnormal1"/>
+        <w:numPr>
+          <w:ilvl w:val="0"/>
+          <w:numId w:val="0"/>
+        </w:numPr>
+        <w:ind w:left="360"/>
+        <w:rPr>
+          <w:rFonts w:ascii="Arial" w:hAnsi="Arial"/>
+          <w:sz w:val="24"/>
+          <w:szCs w:val="14"/>
+          <w:lang w:eastAsia="fr-FR"/>
+        </w:rPr>
+      </w:pPr>
+      <w:r>
+        <w:rPr>
+          <w:rFonts w:ascii="Arial" w:hAnsi="Arial"/>
+          <w:sz w:val="24"/>
+          <w:szCs w:val="14"/>
+          <w:lang w:eastAsia="fr-FR"/>
+        </w:rPr>
+        <w:t>Modifications sur la page d’affichage des véhicules : le client souhaite que je change la vue. Une barre de navigation s’ajoutera en haut de la page pour comprendre ce que chaque ligne signifie, je vais probablement juste ajouter un genre de « NAV » en haut. Je vais devoir trouver l’affichage du composant et créer une NAV et l’ajouter moi-même. Ensuite, les statuts devront être modifiés car là, on voit seulement des points bleus comme sur l'image ci-dessous, ce qui n’est pas compréhensible. Il faudra qu’ils soient changés en un état et affichés. Ensuite, afficher les courses avec la date et l’heure en dessous des courses. Pour finir, enlever les logos des images d’essence et mettre des états écrits avec, je suppose, un changement de couleur de vert à rouge. Pour cela, il va falloir trouver le composant, l'ajouter et le modifier pour répondre à la demande du client.</w:t>
+      </w:r>
+      <w:bookmarkStart w:id="6" w:name="_GoBack"/>
+      <w:bookmarkEnd w:id="6"/>
+    </w:p>
+    <w:p>
+      <w:pPr>
+        <w:pStyle w:val="Retraitnormal1"/>
+        <w:numPr>
+          <w:ilvl w:val="0"/>
+          <w:numId w:val="0"/>
+        </w:numPr>
+        <w:ind w:left="360"/>
+        <w:rPr>
+          <w:rFonts w:ascii="Arial" w:hAnsi="Arial"/>
+          <w:sz w:val="24"/>
+          <w:szCs w:val="14"/>
+          <w:lang w:eastAsia="fr-FR"/>
+        </w:rPr>
+      </w:pPr>
+    </w:p>
+    <w:p>
+      <w:pPr>
+        <w:pStyle w:val="Retraitnormal1"/>
+        <w:numPr>
+          <w:ilvl w:val="0"/>
+          <w:numId w:val="0"/>
+        </w:numPr>
+        <w:ind w:left="360"/>
+        <w:rPr>
+          <w:rFonts w:ascii="Arial" w:hAnsi="Arial"/>
+          <w:sz w:val="24"/>
+          <w:szCs w:val="14"/>
+          <w:lang w:eastAsia="fr-FR"/>
+        </w:rPr>
+      </w:pPr>
+    </w:p>
+    <w:p>
+      <w:pPr>
+        <w:pStyle w:val="Retraitnormal1"/>
+        <w:numPr>
+          <w:ilvl w:val="0"/>
+          <w:numId w:val="0"/>
+        </w:numPr>
+        <w:ind w:left="360"/>
+        <w:rPr>
+          <w:rFonts w:ascii="Arial" w:hAnsi="Arial"/>
+          <w:i/>
+          <w:iCs/>
+          <w:sz w:val="24"/>
+          <w:szCs w:val="24"/>
+          <w:lang w:eastAsia="fr-FR"/>
+        </w:rPr>
+      </w:pPr>
+      <w:r>
+        <w:rPr>
+          <w:rFonts w:ascii="Arial" w:hAnsi="Arial"/>
+          <w:i/>
+          <w:iCs/>
+          <w:sz w:val="24"/>
+          <w:szCs w:val="24"/>
+          <w:lang w:eastAsia="fr-FR"/>
+        </w:rPr>
+        <w:t>Le concept</w:t>
+      </w:r>
+      <w:r>
+        <w:rPr>
+          <w:rFonts w:ascii="Arial" w:hAnsi="Arial"/>
+          <w:i/>
+          <w:iCs/>
+          <w:sz w:val="24"/>
+          <w:szCs w:val="24"/>
+          <w:lang w:eastAsia="fr-FR"/>
+        </w:rPr>
+        <w:t xml:space="preserve"> complet avec toutes ses </w:t>
+      </w:r>
+      <w:r>
+        <w:rPr>
+          <w:rFonts w:ascii="Arial" w:hAnsi="Arial"/>
+          <w:i/>
+          <w:iCs/>
+          <w:sz w:val="24"/>
+          <w:szCs w:val="24"/>
+          <w:lang w:eastAsia="fr-FR"/>
+        </w:rPr>
+        <w:t>annexes :</w:t>
+      </w:r>
+    </w:p>
+    <w:p>
+      <w:pPr>
+        <w:pStyle w:val="Retraitnormal1"/>
+        <w:numPr>
+          <w:ilvl w:val="0"/>
+          <w:numId w:val="0"/>
+        </w:numPr>
+        <w:ind w:left="360"/>
+        <w:rPr>
+          <w:rFonts w:ascii="Arial" w:hAnsi="Arial"/>
+          <w:i/>
+          <w:iCs/>
+          <w:sz w:val="24"/>
+          <w:szCs w:val="14"/>
+          <w:lang w:eastAsia="fr-FR"/>
+        </w:rPr>
+      </w:pPr>
+    </w:p>
+    <w:p>
+      <w:pPr>
+        <w:pStyle w:val="Retraitnormal1"/>
+        <w:numPr>
+          <w:ilvl w:val="0"/>
+          <w:numId w:val="0"/>
+        </w:numPr>
+        <w:ind w:left="360"/>
+        <w:rPr>
+          <w:rFonts w:ascii="Arial" w:hAnsi="Arial"/>
+          <w:i/>
+          <w:iCs/>
+          <w:color w:val="FF0000"/>
+          <w:sz w:val="24"/>
+          <w:szCs w:val="14"/>
+          <w:lang w:eastAsia="fr-FR"/>
+        </w:rPr>
+      </w:pPr>
+      <w:r>
+        <w:rPr>
+          <w:rFonts w:ascii="Arial" w:hAnsi="Arial"/>
+          <w:i/>
+          <w:iCs/>
+          <w:color w:val="FF0000"/>
+          <w:sz w:val="24"/>
+          <w:szCs w:val="14"/>
+          <w:lang w:eastAsia="fr-FR"/>
+        </w:rPr>
+        <w:t>Au minimum :</w:t>
+      </w:r>
+    </w:p>
+    <w:p>
+      <w:pPr>
+        <w:pStyle w:val="Retraitnormal1"/>
+        <w:numPr>
+          <w:ilvl w:val="0"/>
+          <w:numId w:val="15"/>
+        </w:numPr>
+        <w:rPr>
+          <w:rFonts w:ascii="Arial" w:hAnsi="Arial"/>
+          <w:i/>
+          <w:iCs/>
+          <w:color w:val="FF0000"/>
+          <w:sz w:val="24"/>
+          <w:szCs w:val="14"/>
+          <w:lang w:eastAsia="fr-FR"/>
+        </w:rPr>
+      </w:pPr>
+      <w:r>
+        <w:rPr>
+          <w:rFonts w:ascii="Arial" w:hAnsi="Arial"/>
+          <w:i/>
+          <w:iCs/>
+          <w:color w:val="FF0000"/>
+          <w:sz w:val="24"/>
+          <w:szCs w:val="14"/>
+          <w:lang w:eastAsia="fr-FR"/>
+        </w:rPr>
+        <w:t>Un ou plusieurs schémas de contexte montrant le système dans son environnement d’utilisation, ainsi que ses utilisateurs. Ce type schéma doit être accompagné d’explications textuelles</w:t>
+      </w:r>
+    </w:p>
+    <w:p>
+      <w:pPr>
+        <w:pStyle w:val="Retraitnormal1"/>
+        <w:numPr>
+          <w:ilvl w:val="0"/>
+          <w:numId w:val="15"/>
+        </w:numPr>
+        <w:rPr>
+          <w:rFonts w:ascii="Arial" w:hAnsi="Arial"/>
+          <w:i/>
+          <w:iCs/>
+          <w:color w:val="FF0000"/>
+          <w:sz w:val="24"/>
+          <w:szCs w:val="14"/>
+          <w:lang w:eastAsia="fr-FR"/>
+        </w:rPr>
+      </w:pPr>
+      <w:r>
+        <w:rPr>
+          <w:rFonts w:ascii="Arial" w:hAnsi="Arial"/>
+          <w:i/>
+          <w:iCs/>
+          <w:color w:val="FF0000"/>
+          <w:sz w:val="24"/>
+          <w:szCs w:val="14"/>
+          <w:lang w:eastAsia="fr-FR"/>
+        </w:rPr>
+        <w:t xml:space="preserve">Un ou plusieurs schémas d’architecture montrant la structure </w:t>
+      </w:r>
+      <w:r>
+        <w:rPr>
+          <w:rFonts w:ascii="Arial" w:hAnsi="Arial"/>
+          <w:i/>
+          <w:iCs/>
+          <w:color w:val="FF0000"/>
+          <w:sz w:val="24"/>
+          <w:szCs w:val="14"/>
+          <w:lang w:eastAsia="fr-FR"/>
+        </w:rPr>
+        <w:t xml:space="preserve">interne </w:t>
+      </w:r>
+      <w:r>
+        <w:rPr>
+          <w:rFonts w:ascii="Arial" w:hAnsi="Arial"/>
+          <w:i/>
+          <w:iCs/>
+          <w:color w:val="FF0000"/>
+          <w:sz w:val="24"/>
+          <w:szCs w:val="14"/>
+          <w:lang w:eastAsia="fr-FR"/>
+        </w:rPr>
+        <w:t>du système. Ce type schéma doit être accompagné d’explications textuelles</w:t>
+      </w:r>
+    </w:p>
+    <w:p>
+      <w:pPr>
+        <w:pStyle w:val="Retraitnormal1"/>
+        <w:numPr>
+          <w:ilvl w:val="0"/>
+          <w:numId w:val="15"/>
+        </w:numPr>
+        <w:rPr>
+          <w:rFonts w:ascii="Arial" w:hAnsi="Arial"/>
+          <w:i/>
+          <w:iCs/>
+          <w:color w:val="FF0000"/>
+          <w:sz w:val="24"/>
+          <w:szCs w:val="14"/>
+          <w:lang w:eastAsia="fr-FR"/>
+        </w:rPr>
+      </w:pPr>
+      <w:r>
+        <w:rPr>
+          <w:rFonts w:ascii="Arial" w:hAnsi="Arial"/>
+          <w:i/>
+          <w:iCs/>
+          <w:color w:val="FF0000"/>
+          <w:sz w:val="24"/>
+          <w:szCs w:val="14"/>
+          <w:lang w:eastAsia="fr-FR"/>
+        </w:rPr>
+        <w:t>Un modèle conceptuel des données</w:t>
+      </w:r>
+      <w:r>
+        <w:rPr>
+          <w:rFonts w:ascii="Arial" w:hAnsi="Arial"/>
+          <w:i/>
+          <w:iCs/>
+          <w:color w:val="FF0000"/>
+          <w:sz w:val="24"/>
+          <w:szCs w:val="14"/>
+          <w:lang w:eastAsia="fr-FR"/>
+        </w:rPr>
+        <w:t xml:space="preserve">, accompagné d’une explication pour chaque entité/attribut possédant une </w:t>
+      </w:r>
+      <w:commentRangeStart w:id="7"/>
+      <w:r>
+        <w:rPr>
+          <w:rFonts w:ascii="Arial" w:hAnsi="Arial"/>
+          <w:i/>
+          <w:iCs/>
+          <w:color w:val="FF0000"/>
+          <w:sz w:val="24"/>
+          <w:szCs w:val="14"/>
+          <w:lang w:eastAsia="fr-FR"/>
+        </w:rPr>
+        <w:t>particularité</w:t>
+      </w:r>
+      <w:commentRangeEnd w:id="7"/>
+      <w:r>
+        <w:rPr>
+          <w:rStyle w:val="Marquedecommentaire"/>
+          <w:rFonts w:ascii="Arial" w:hAnsi="Arial"/>
+          <w:lang w:eastAsia="fr-FR"/>
+        </w:rPr>
+        <w:commentReference w:id="7"/>
+      </w:r>
+      <w:r>
+        <w:rPr>
+          <w:rFonts w:ascii="Arial" w:hAnsi="Arial"/>
+          <w:i/>
+          <w:iCs/>
+          <w:color w:val="FF0000"/>
+          <w:sz w:val="24"/>
+          <w:szCs w:val="14"/>
+          <w:lang w:eastAsia="fr-FR"/>
+        </w:rPr>
+        <w:t>.</w:t>
+      </w:r>
+    </w:p>
+    <w:p>
+      <w:pPr>
+        <w:pStyle w:val="Retraitnormal1"/>
+        <w:numPr>
+          <w:ilvl w:val="0"/>
+          <w:numId w:val="0"/>
+        </w:numPr>
+        <w:ind w:left="360"/>
+        <w:rPr>
+          <w:rFonts w:ascii="Arial" w:hAnsi="Arial"/>
+          <w:i/>
+          <w:iCs/>
+          <w:color w:val="FF0000"/>
+          <w:sz w:val="24"/>
+          <w:szCs w:val="14"/>
+          <w:lang w:eastAsia="fr-FR"/>
+        </w:rPr>
+      </w:pPr>
+    </w:p>
+    <w:p>
+      <w:pPr>
+        <w:pStyle w:val="Retraitnormal1"/>
+        <w:numPr>
+          <w:ilvl w:val="0"/>
+          <w:numId w:val="0"/>
+        </w:numPr>
+        <w:ind w:left="360"/>
         <w:rPr>
           <w:rFonts w:ascii="Arial" w:hAnsi="Arial"/>
           <w:i/>
@@ -4768,6 +5162,7 @@
           <w:szCs w:val="24"/>
           <w:lang w:eastAsia="fr-FR"/>
         </w:rPr>
+        <w:lastRenderedPageBreak/>
         <w:t>Multimédia :</w:t>
       </w:r>
       <w:r>
@@ -4930,7 +5325,6 @@
           <w:szCs w:val="24"/>
           <w:lang w:eastAsia="fr-FR"/>
         </w:rPr>
-        <w:lastRenderedPageBreak/>
         <w:t>Programmation :</w:t>
       </w:r>
       <w:r>
@@ -5179,7 +5573,7 @@
                     </pic:cNvPicPr>
                   </pic:nvPicPr>
                   <pic:blipFill>
-                    <a:blip r:embed="rId13">
+                    <a:blip r:embed="rId14">
                       <a:extLst>
                         <a:ext uri="{28A0092B-C50C-407E-A947-70E740481C1C}">
                           <a14:useLocalDpi xmlns:a14="http://schemas.microsoft.com/office/drawing/2010/main" val="0"/>
@@ -5500,7 +5894,7 @@
                     </pic:cNvPicPr>
                   </pic:nvPicPr>
                   <pic:blipFill>
-                    <a:blip r:embed="rId14" cstate="print">
+                    <a:blip r:embed="rId15" cstate="print">
                       <a:extLst>
                         <a:ext uri="{28A0092B-C50C-407E-A947-70E740481C1C}">
                           <a14:useLocalDpi xmlns:a14="http://schemas.microsoft.com/office/drawing/2010/main" val="0"/>
@@ -5898,7 +6292,7 @@
                     </pic:cNvPicPr>
                   </pic:nvPicPr>
                   <pic:blipFill>
-                    <a:blip r:embed="rId15">
+                    <a:blip r:embed="rId16">
                       <a:extLst>
                         <a:ext uri="{28A0092B-C50C-407E-A947-70E740481C1C}">
                           <a14:useLocalDpi xmlns:a14="http://schemas.microsoft.com/office/drawing/2010/main" val="0"/>
@@ -9361,7 +9755,7 @@
         </w:rPr>
         <w:t xml:space="preserve">Reporter la </w:t>
       </w:r>
-      <w:hyperlink r:id="rId16" w:anchor=":~:text=La%20dette%20technique%20survient%20quand,de%20plus%20en%20plus%20fr%C3%A9quents.">
+      <w:hyperlink r:id="rId17" w:anchor=":~:text=La%20dette%20technique%20survient%20quand,de%20plus%20en%20plus%20fr%C3%A9quents.">
         <w:r>
           <w:rPr>
             <w:rStyle w:val="Lienhypertexte"/>
@@ -10491,8 +10885,8 @@
       </w:pPr>
     </w:p>
     <w:sectPr>
-      <w:headerReference w:type="default" r:id="rId17"/>
-      <w:footerReference w:type="default" r:id="rId18"/>
+      <w:headerReference w:type="default" r:id="rId18"/>
+      <w:footerReference w:type="default" r:id="rId19"/>
       <w:pgSz w:w="11906" w:h="16838" w:code="9"/>
       <w:pgMar w:top="1418" w:right="1418" w:bottom="1418" w:left="1418" w:header="720" w:footer="720" w:gutter="0"/>
       <w:cols w:space="720"/>
@@ -10616,7 +11010,7 @@
         <w:sz w:val="16"/>
         <w:szCs w:val="16"/>
       </w:rPr>
-      <w:t>7</w:t>
+      <w:t>17</w:t>
     </w:r>
     <w:r>
       <w:rPr>

</xml_diff>